<commit_message>
docs: manual v1.4 — corrections, new features, beginner clarity
</commit_message>
<xml_diff>
--- a/NCA_Assistant_User_Manual_v1.4.docx
+++ b/NCA_Assistant_User_Manual_v1.4.docx
@@ -48,7 +48,7 @@
           <w:sz w:val="24"/>
           <w:szCs w:val="24"/>
         </w:rPr>
-        <w:t>Version 1.3</w:t>
+        <w:t>Version 1.4</w:t>
       </w:r>
     </w:p>
     <w:p>
@@ -128,7 +128,7 @@
           <w:sz w:val="18"/>
           <w:szCs w:val="18"/>
         </w:rPr>
-        <w:t>Manual version 1.3 — corresponds to NCA Assistant v1.2</w:t>
+        <w:t>Manual version 1.4 — corresponds to NCA Assistant v1.2</w:t>
       </w:r>
     </w:p>
     <w:p>
@@ -680,6 +680,104 @@
                 <w:szCs w:val="20"/>
               </w:rPr>
               <w:t>New chapter 3 (Visualize Data); chapters 3–5 renumbered to 4–6; hub layout updated to 3+3 grid; attribution updated</w:t>
+            </w:r>
+          </w:p>
+        </w:tc>
+      </w:tr>
+      <w:tr>
+        <w:tc>
+          <w:tcPr>
+            <w:tcW w:w="1500" w:type="dxa"/>
+            <w:tcBorders>
+              <w:top w:val="single" w:sz="1" w:space="0" w:color="CCCCCC"/>
+              <w:left w:val="single" w:sz="1" w:space="0" w:color="CCCCCC"/>
+              <w:bottom w:val="single" w:sz="1" w:space="0" w:color="CCCCCC"/>
+              <w:right w:val="single" w:sz="1" w:space="0" w:color="CCCCCC"/>
+            </w:tcBorders>
+            <w:tcMar>
+              <w:top w:w="60" w:type="dxa"/>
+              <w:left w:w="100" w:type="dxa"/>
+              <w:bottom w:w="60" w:type="dxa"/>
+              <w:right w:w="100" w:type="dxa"/>
+            </w:tcMar>
+          </w:tcPr>
+          <w:p>
+            <w:r>
+              <w:rPr>
+                <w:sz w:val="20"/>
+                <w:szCs w:val="20"/>
+              </w:rPr>
+              <w:t>1.4</w:t>
+            </w:r>
+          </w:p>
+        </w:tc>
+        <w:tc>
+          <w:tcPr>
+            <w:tcW w:w="2000" w:type="dxa"/>
+            <w:tcBorders>
+              <w:top w:val="single" w:sz="1" w:space="0" w:color="CCCCCC"/>
+              <w:left w:val="single" w:sz="1" w:space="0" w:color="CCCCCC"/>
+              <w:bottom w:val="single" w:sz="1" w:space="0" w:color="CCCCCC"/>
+              <w:right w:val="single" w:sz="1" w:space="0" w:color="CCCCCC"/>
+            </w:tcBorders>
+            <w:tcMar>
+              <w:top w:w="60" w:type="dxa"/>
+              <w:left w:w="100" w:type="dxa"/>
+              <w:bottom w:w="60" w:type="dxa"/>
+              <w:right w:w="100" w:type="dxa"/>
+            </w:tcMar>
+          </w:tcPr>
+          <w:p>
+            <w:r>
+              <w:rPr>
+                <w:sz w:val="20"/>
+                <w:szCs w:val="20"/>
+              </w:rPr>
+              <w:t>April 2026</w:t>
+            </w:r>
+          </w:p>
+        </w:tc>
+        <w:tc>
+          <w:tcPr>
+            <w:tcW w:w="2526" w:type="dxa"/>
+            <w:tcBorders>
+              <w:top w:val="single" w:sz="1" w:space="0" w:color="CCCCCC"/>
+              <w:left w:val="single" w:sz="1" w:space="0" w:color="CCCCCC"/>
+              <w:bottom w:val="single" w:sz="1" w:space="0" w:color="CCCCCC"/>
+              <w:right w:val="single" w:sz="1" w:space="0" w:color="CCCCCC"/>
+            </w:tcBorders>
+            <w:tcMar>
+              <w:top w:w="60" w:type="dxa"/>
+              <w:left w:w="100" w:type="dxa"/>
+              <w:bottom w:w="60" w:type="dxa"/>
+              <w:right w:w="100" w:type="dxa"/>
+            </w:tcMar>
+          </w:tcPr>
+          <w:p/>
+        </w:tc>
+        <w:tc>
+          <w:tcPr>
+            <w:tcW w:w="3000" w:type="dxa"/>
+            <w:tcBorders>
+              <w:top w:val="single" w:sz="1" w:space="0" w:color="CCCCCC"/>
+              <w:left w:val="single" w:sz="1" w:space="0" w:color="CCCCCC"/>
+              <w:bottom w:val="single" w:sz="1" w:space="0" w:color="CCCCCC"/>
+              <w:right w:val="single" w:sz="1" w:space="0" w:color="CCCCCC"/>
+            </w:tcBorders>
+            <w:tcMar>
+              <w:top w:w="60" w:type="dxa"/>
+              <w:left w:w="100" w:type="dxa"/>
+              <w:bottom w:w="60" w:type="dxa"/>
+              <w:right w:w="100" w:type="dxa"/>
+            </w:tcMar>
+          </w:tcPr>
+          <w:p>
+            <w:r>
+              <w:rPr>
+                <w:sz w:val="20"/>
+                <w:szCs w:val="20"/>
+              </w:rPr>
+              <w:t>Factual corrections (Rule 6 label, AUC extrapolation flag); new feature documentation (steady-state in BE, balance check, design summary, Apply LLOQ button, excluded profiles note); beginner clarity additions (LLOQ/BLQ definitions, extravascular explained, R² failure consequences, SHA-256 explained, half-life review how-to, AUC % Extrapolated meaning)</w:t>
             </w:r>
           </w:p>
         </w:tc>

</xml_diff>

<commit_message>
docs: generic decimal separator language in data guide and manual; add gap threshold to troubleshooting
</commit_message>
<xml_diff>
--- a/NCA_Assistant_User_Manual_v1.4.docx
+++ b/NCA_Assistant_User_Manual_v1.4.docx
@@ -817,7 +817,11 @@
           </w:pPr>
           <w:r>
             <w:fldChar w:fldCharType="begin"/>
+          </w:r>
+          <w:r>
             <w:instrText>TOC \h \o "1-3"</w:instrText>
+          </w:r>
+          <w:r>
             <w:fldChar w:fldCharType="separate"/>
           </w:r>
           <w:hyperlink w:anchor="_Toc226195249" w:history="1">
@@ -833,10 +837,40 @@
                 <w:noProof/>
               </w:rPr>
               <w:tab/>
+            </w:r>
+            <w:r>
+              <w:rPr>
+                <w:noProof/>
+              </w:rPr>
               <w:fldChar w:fldCharType="begin"/>
+            </w:r>
+            <w:r>
+              <w:rPr>
+                <w:noProof/>
+              </w:rPr>
               <w:instrText xml:space="preserve"> PAGEREF _Toc226195249 \h </w:instrText>
+            </w:r>
+            <w:r>
+              <w:rPr>
+                <w:noProof/>
+              </w:rPr>
+            </w:r>
+            <w:r>
+              <w:rPr>
+                <w:noProof/>
+              </w:rPr>
               <w:fldChar w:fldCharType="separate"/>
+            </w:r>
+            <w:r>
+              <w:rPr>
+                <w:noProof/>
+              </w:rPr>
               <w:t>2</w:t>
+            </w:r>
+            <w:r>
+              <w:rPr>
+                <w:noProof/>
+              </w:rPr>
               <w:fldChar w:fldCharType="end"/>
             </w:r>
           </w:hyperlink>
@@ -864,10 +898,40 @@
                 <w:noProof/>
               </w:rPr>
               <w:tab/>
+            </w:r>
+            <w:r>
+              <w:rPr>
+                <w:noProof/>
+              </w:rPr>
               <w:fldChar w:fldCharType="begin"/>
+            </w:r>
+            <w:r>
+              <w:rPr>
+                <w:noProof/>
+              </w:rPr>
               <w:instrText xml:space="preserve"> PAGEREF _Toc226195250 \h </w:instrText>
+            </w:r>
+            <w:r>
+              <w:rPr>
+                <w:noProof/>
+              </w:rPr>
+            </w:r>
+            <w:r>
+              <w:rPr>
+                <w:noProof/>
+              </w:rPr>
               <w:fldChar w:fldCharType="separate"/>
+            </w:r>
+            <w:r>
+              <w:rPr>
+                <w:noProof/>
+              </w:rPr>
               <w:t>3</w:t>
+            </w:r>
+            <w:r>
+              <w:rPr>
+                <w:noProof/>
+              </w:rPr>
               <w:fldChar w:fldCharType="end"/>
             </w:r>
           </w:hyperlink>
@@ -895,10 +959,40 @@
                 <w:noProof/>
               </w:rPr>
               <w:tab/>
+            </w:r>
+            <w:r>
+              <w:rPr>
+                <w:noProof/>
+              </w:rPr>
               <w:fldChar w:fldCharType="begin"/>
+            </w:r>
+            <w:r>
+              <w:rPr>
+                <w:noProof/>
+              </w:rPr>
               <w:instrText xml:space="preserve"> PAGEREF _Toc226195251 \h </w:instrText>
+            </w:r>
+            <w:r>
+              <w:rPr>
+                <w:noProof/>
+              </w:rPr>
+            </w:r>
+            <w:r>
+              <w:rPr>
+                <w:noProof/>
+              </w:rPr>
               <w:fldChar w:fldCharType="separate"/>
+            </w:r>
+            <w:r>
+              <w:rPr>
+                <w:noProof/>
+              </w:rPr>
               <w:t>5</w:t>
+            </w:r>
+            <w:r>
+              <w:rPr>
+                <w:noProof/>
+              </w:rPr>
               <w:fldChar w:fldCharType="end"/>
             </w:r>
           </w:hyperlink>
@@ -926,10 +1020,40 @@
                 <w:noProof/>
               </w:rPr>
               <w:tab/>
+            </w:r>
+            <w:r>
+              <w:rPr>
+                <w:noProof/>
+              </w:rPr>
               <w:fldChar w:fldCharType="begin"/>
+            </w:r>
+            <w:r>
+              <w:rPr>
+                <w:noProof/>
+              </w:rPr>
               <w:instrText xml:space="preserve"> PAGEREF _Toc226195252 \h </w:instrText>
+            </w:r>
+            <w:r>
+              <w:rPr>
+                <w:noProof/>
+              </w:rPr>
+            </w:r>
+            <w:r>
+              <w:rPr>
+                <w:noProof/>
+              </w:rPr>
               <w:fldChar w:fldCharType="separate"/>
+            </w:r>
+            <w:r>
+              <w:rPr>
+                <w:noProof/>
+              </w:rPr>
               <w:t>6</w:t>
+            </w:r>
+            <w:r>
+              <w:rPr>
+                <w:noProof/>
+              </w:rPr>
               <w:fldChar w:fldCharType="end"/>
             </w:r>
           </w:hyperlink>
@@ -957,10 +1081,40 @@
                 <w:noProof/>
               </w:rPr>
               <w:tab/>
+            </w:r>
+            <w:r>
+              <w:rPr>
+                <w:noProof/>
+              </w:rPr>
               <w:fldChar w:fldCharType="begin"/>
+            </w:r>
+            <w:r>
+              <w:rPr>
+                <w:noProof/>
+              </w:rPr>
               <w:instrText xml:space="preserve"> PAGEREF _Toc226195253 \h </w:instrText>
+            </w:r>
+            <w:r>
+              <w:rPr>
+                <w:noProof/>
+              </w:rPr>
+            </w:r>
+            <w:r>
+              <w:rPr>
+                <w:noProof/>
+              </w:rPr>
               <w:fldChar w:fldCharType="separate"/>
+            </w:r>
+            <w:r>
+              <w:rPr>
+                <w:noProof/>
+              </w:rPr>
               <w:t>6</w:t>
+            </w:r>
+            <w:r>
+              <w:rPr>
+                <w:noProof/>
+              </w:rPr>
               <w:fldChar w:fldCharType="end"/>
             </w:r>
           </w:hyperlink>
@@ -988,10 +1142,40 @@
                 <w:noProof/>
               </w:rPr>
               <w:tab/>
+            </w:r>
+            <w:r>
+              <w:rPr>
+                <w:noProof/>
+              </w:rPr>
               <w:fldChar w:fldCharType="begin"/>
+            </w:r>
+            <w:r>
+              <w:rPr>
+                <w:noProof/>
+              </w:rPr>
               <w:instrText xml:space="preserve"> PAGEREF _Toc226195254 \h </w:instrText>
+            </w:r>
+            <w:r>
+              <w:rPr>
+                <w:noProof/>
+              </w:rPr>
+            </w:r>
+            <w:r>
+              <w:rPr>
+                <w:noProof/>
+              </w:rPr>
               <w:fldChar w:fldCharType="separate"/>
+            </w:r>
+            <w:r>
+              <w:rPr>
+                <w:noProof/>
+              </w:rPr>
               <w:t>6</w:t>
+            </w:r>
+            <w:r>
+              <w:rPr>
+                <w:noProof/>
+              </w:rPr>
               <w:fldChar w:fldCharType="end"/>
             </w:r>
           </w:hyperlink>
@@ -1019,10 +1203,40 @@
                 <w:noProof/>
               </w:rPr>
               <w:tab/>
+            </w:r>
+            <w:r>
+              <w:rPr>
+                <w:noProof/>
+              </w:rPr>
               <w:fldChar w:fldCharType="begin"/>
+            </w:r>
+            <w:r>
+              <w:rPr>
+                <w:noProof/>
+              </w:rPr>
               <w:instrText xml:space="preserve"> PAGEREF _Toc226195255 \h </w:instrText>
+            </w:r>
+            <w:r>
+              <w:rPr>
+                <w:noProof/>
+              </w:rPr>
+            </w:r>
+            <w:r>
+              <w:rPr>
+                <w:noProof/>
+              </w:rPr>
               <w:fldChar w:fldCharType="separate"/>
+            </w:r>
+            <w:r>
+              <w:rPr>
+                <w:noProof/>
+              </w:rPr>
               <w:t>6</w:t>
+            </w:r>
+            <w:r>
+              <w:rPr>
+                <w:noProof/>
+              </w:rPr>
               <w:fldChar w:fldCharType="end"/>
             </w:r>
           </w:hyperlink>
@@ -1050,10 +1264,40 @@
                 <w:noProof/>
               </w:rPr>
               <w:tab/>
+            </w:r>
+            <w:r>
+              <w:rPr>
+                <w:noProof/>
+              </w:rPr>
               <w:fldChar w:fldCharType="begin"/>
+            </w:r>
+            <w:r>
+              <w:rPr>
+                <w:noProof/>
+              </w:rPr>
               <w:instrText xml:space="preserve"> PAGEREF _Toc226195256 \h </w:instrText>
+            </w:r>
+            <w:r>
+              <w:rPr>
+                <w:noProof/>
+              </w:rPr>
+            </w:r>
+            <w:r>
+              <w:rPr>
+                <w:noProof/>
+              </w:rPr>
               <w:fldChar w:fldCharType="separate"/>
+            </w:r>
+            <w:r>
+              <w:rPr>
+                <w:noProof/>
+              </w:rPr>
               <w:t>6</w:t>
+            </w:r>
+            <w:r>
+              <w:rPr>
+                <w:noProof/>
+              </w:rPr>
               <w:fldChar w:fldCharType="end"/>
             </w:r>
           </w:hyperlink>
@@ -1081,10 +1325,40 @@
                 <w:noProof/>
               </w:rPr>
               <w:tab/>
+            </w:r>
+            <w:r>
+              <w:rPr>
+                <w:noProof/>
+              </w:rPr>
               <w:fldChar w:fldCharType="begin"/>
+            </w:r>
+            <w:r>
+              <w:rPr>
+                <w:noProof/>
+              </w:rPr>
               <w:instrText xml:space="preserve"> PAGEREF _Toc226195257 \h </w:instrText>
+            </w:r>
+            <w:r>
+              <w:rPr>
+                <w:noProof/>
+              </w:rPr>
+            </w:r>
+            <w:r>
+              <w:rPr>
+                <w:noProof/>
+              </w:rPr>
               <w:fldChar w:fldCharType="separate"/>
+            </w:r>
+            <w:r>
+              <w:rPr>
+                <w:noProof/>
+              </w:rPr>
               <w:t>6</w:t>
+            </w:r>
+            <w:r>
+              <w:rPr>
+                <w:noProof/>
+              </w:rPr>
               <w:fldChar w:fldCharType="end"/>
             </w:r>
           </w:hyperlink>
@@ -1112,10 +1386,40 @@
                 <w:noProof/>
               </w:rPr>
               <w:tab/>
+            </w:r>
+            <w:r>
+              <w:rPr>
+                <w:noProof/>
+              </w:rPr>
               <w:fldChar w:fldCharType="begin"/>
+            </w:r>
+            <w:r>
+              <w:rPr>
+                <w:noProof/>
+              </w:rPr>
               <w:instrText xml:space="preserve"> PAGEREF _Toc226195258 \h </w:instrText>
+            </w:r>
+            <w:r>
+              <w:rPr>
+                <w:noProof/>
+              </w:rPr>
+            </w:r>
+            <w:r>
+              <w:rPr>
+                <w:noProof/>
+              </w:rPr>
               <w:fldChar w:fldCharType="separate"/>
+            </w:r>
+            <w:r>
+              <w:rPr>
+                <w:noProof/>
+              </w:rPr>
               <w:t>8</w:t>
+            </w:r>
+            <w:r>
+              <w:rPr>
+                <w:noProof/>
+              </w:rPr>
               <w:fldChar w:fldCharType="end"/>
             </w:r>
           </w:hyperlink>
@@ -1143,10 +1447,40 @@
                 <w:noProof/>
               </w:rPr>
               <w:tab/>
+            </w:r>
+            <w:r>
+              <w:rPr>
+                <w:noProof/>
+              </w:rPr>
               <w:fldChar w:fldCharType="begin"/>
+            </w:r>
+            <w:r>
+              <w:rPr>
+                <w:noProof/>
+              </w:rPr>
               <w:instrText xml:space="preserve"> PAGEREF _Toc226195259 \h </w:instrText>
+            </w:r>
+            <w:r>
+              <w:rPr>
+                <w:noProof/>
+              </w:rPr>
+            </w:r>
+            <w:r>
+              <w:rPr>
+                <w:noProof/>
+              </w:rPr>
               <w:fldChar w:fldCharType="separate"/>
+            </w:r>
+            <w:r>
+              <w:rPr>
+                <w:noProof/>
+              </w:rPr>
               <w:t>8</w:t>
+            </w:r>
+            <w:r>
+              <w:rPr>
+                <w:noProof/>
+              </w:rPr>
               <w:fldChar w:fldCharType="end"/>
             </w:r>
           </w:hyperlink>
@@ -1174,10 +1508,40 @@
                 <w:noProof/>
               </w:rPr>
               <w:tab/>
+            </w:r>
+            <w:r>
+              <w:rPr>
+                <w:noProof/>
+              </w:rPr>
               <w:fldChar w:fldCharType="begin"/>
+            </w:r>
+            <w:r>
+              <w:rPr>
+                <w:noProof/>
+              </w:rPr>
               <w:instrText xml:space="preserve"> PAGEREF _Toc226195260 \h </w:instrText>
+            </w:r>
+            <w:r>
+              <w:rPr>
+                <w:noProof/>
+              </w:rPr>
+            </w:r>
+            <w:r>
+              <w:rPr>
+                <w:noProof/>
+              </w:rPr>
               <w:fldChar w:fldCharType="separate"/>
+            </w:r>
+            <w:r>
+              <w:rPr>
+                <w:noProof/>
+              </w:rPr>
               <w:t>8</w:t>
+            </w:r>
+            <w:r>
+              <w:rPr>
+                <w:noProof/>
+              </w:rPr>
               <w:fldChar w:fldCharType="end"/>
             </w:r>
           </w:hyperlink>
@@ -1205,10 +1569,40 @@
                 <w:noProof/>
               </w:rPr>
               <w:tab/>
+            </w:r>
+            <w:r>
+              <w:rPr>
+                <w:noProof/>
+              </w:rPr>
               <w:fldChar w:fldCharType="begin"/>
+            </w:r>
+            <w:r>
+              <w:rPr>
+                <w:noProof/>
+              </w:rPr>
               <w:instrText xml:space="preserve"> PAGEREF _Toc226195261 \h </w:instrText>
+            </w:r>
+            <w:r>
+              <w:rPr>
+                <w:noProof/>
+              </w:rPr>
+            </w:r>
+            <w:r>
+              <w:rPr>
+                <w:noProof/>
+              </w:rPr>
               <w:fldChar w:fldCharType="separate"/>
+            </w:r>
+            <w:r>
+              <w:rPr>
+                <w:noProof/>
+              </w:rPr>
               <w:t>8</w:t>
+            </w:r>
+            <w:r>
+              <w:rPr>
+                <w:noProof/>
+              </w:rPr>
               <w:fldChar w:fldCharType="end"/>
             </w:r>
           </w:hyperlink>
@@ -1236,10 +1630,40 @@
                 <w:noProof/>
               </w:rPr>
               <w:tab/>
+            </w:r>
+            <w:r>
+              <w:rPr>
+                <w:noProof/>
+              </w:rPr>
               <w:fldChar w:fldCharType="begin"/>
+            </w:r>
+            <w:r>
+              <w:rPr>
+                <w:noProof/>
+              </w:rPr>
               <w:instrText xml:space="preserve"> PAGEREF _Toc226195262 \h </w:instrText>
+            </w:r>
+            <w:r>
+              <w:rPr>
+                <w:noProof/>
+              </w:rPr>
+            </w:r>
+            <w:r>
+              <w:rPr>
+                <w:noProof/>
+              </w:rPr>
               <w:fldChar w:fldCharType="separate"/>
+            </w:r>
+            <w:r>
+              <w:rPr>
+                <w:noProof/>
+              </w:rPr>
               <w:t>8</w:t>
+            </w:r>
+            <w:r>
+              <w:rPr>
+                <w:noProof/>
+              </w:rPr>
               <w:fldChar w:fldCharType="end"/>
             </w:r>
           </w:hyperlink>
@@ -1267,10 +1691,40 @@
                 <w:noProof/>
               </w:rPr>
               <w:tab/>
+            </w:r>
+            <w:r>
+              <w:rPr>
+                <w:noProof/>
+              </w:rPr>
               <w:fldChar w:fldCharType="begin"/>
+            </w:r>
+            <w:r>
+              <w:rPr>
+                <w:noProof/>
+              </w:rPr>
               <w:instrText xml:space="preserve"> PAGEREF _Toc226195263 \h </w:instrText>
+            </w:r>
+            <w:r>
+              <w:rPr>
+                <w:noProof/>
+              </w:rPr>
+            </w:r>
+            <w:r>
+              <w:rPr>
+                <w:noProof/>
+              </w:rPr>
               <w:fldChar w:fldCharType="separate"/>
+            </w:r>
+            <w:r>
+              <w:rPr>
+                <w:noProof/>
+              </w:rPr>
               <w:t>8</w:t>
+            </w:r>
+            <w:r>
+              <w:rPr>
+                <w:noProof/>
+              </w:rPr>
               <w:fldChar w:fldCharType="end"/>
             </w:r>
           </w:hyperlink>
@@ -1298,10 +1752,40 @@
                 <w:noProof/>
               </w:rPr>
               <w:tab/>
+            </w:r>
+            <w:r>
+              <w:rPr>
+                <w:noProof/>
+              </w:rPr>
               <w:fldChar w:fldCharType="begin"/>
+            </w:r>
+            <w:r>
+              <w:rPr>
+                <w:noProof/>
+              </w:rPr>
               <w:instrText xml:space="preserve"> PAGEREF _Toc226195264 \h </w:instrText>
+            </w:r>
+            <w:r>
+              <w:rPr>
+                <w:noProof/>
+              </w:rPr>
+            </w:r>
+            <w:r>
+              <w:rPr>
+                <w:noProof/>
+              </w:rPr>
               <w:fldChar w:fldCharType="separate"/>
+            </w:r>
+            <w:r>
+              <w:rPr>
+                <w:noProof/>
+              </w:rPr>
               <w:t>9</w:t>
+            </w:r>
+            <w:r>
+              <w:rPr>
+                <w:noProof/>
+              </w:rPr>
               <w:fldChar w:fldCharType="end"/>
             </w:r>
           </w:hyperlink>
@@ -1329,10 +1813,40 @@
                 <w:noProof/>
               </w:rPr>
               <w:tab/>
+            </w:r>
+            <w:r>
+              <w:rPr>
+                <w:noProof/>
+              </w:rPr>
               <w:fldChar w:fldCharType="begin"/>
+            </w:r>
+            <w:r>
+              <w:rPr>
+                <w:noProof/>
+              </w:rPr>
               <w:instrText xml:space="preserve"> PAGEREF _Toc226195265 \h </w:instrText>
+            </w:r>
+            <w:r>
+              <w:rPr>
+                <w:noProof/>
+              </w:rPr>
+            </w:r>
+            <w:r>
+              <w:rPr>
+                <w:noProof/>
+              </w:rPr>
               <w:fldChar w:fldCharType="separate"/>
+            </w:r>
+            <w:r>
+              <w:rPr>
+                <w:noProof/>
+              </w:rPr>
               <w:t>9</w:t>
+            </w:r>
+            <w:r>
+              <w:rPr>
+                <w:noProof/>
+              </w:rPr>
               <w:fldChar w:fldCharType="end"/>
             </w:r>
           </w:hyperlink>
@@ -1360,10 +1874,40 @@
                 <w:noProof/>
               </w:rPr>
               <w:tab/>
+            </w:r>
+            <w:r>
+              <w:rPr>
+                <w:noProof/>
+              </w:rPr>
               <w:fldChar w:fldCharType="begin"/>
+            </w:r>
+            <w:r>
+              <w:rPr>
+                <w:noProof/>
+              </w:rPr>
               <w:instrText xml:space="preserve"> PAGEREF _Toc226195266 \h </w:instrText>
+            </w:r>
+            <w:r>
+              <w:rPr>
+                <w:noProof/>
+              </w:rPr>
+            </w:r>
+            <w:r>
+              <w:rPr>
+                <w:noProof/>
+              </w:rPr>
               <w:fldChar w:fldCharType="separate"/>
+            </w:r>
+            <w:r>
+              <w:rPr>
+                <w:noProof/>
+              </w:rPr>
               <w:t>9</w:t>
+            </w:r>
+            <w:r>
+              <w:rPr>
+                <w:noProof/>
+              </w:rPr>
               <w:fldChar w:fldCharType="end"/>
             </w:r>
           </w:hyperlink>
@@ -1391,10 +1935,40 @@
                 <w:noProof/>
               </w:rPr>
               <w:tab/>
+            </w:r>
+            <w:r>
+              <w:rPr>
+                <w:noProof/>
+              </w:rPr>
               <w:fldChar w:fldCharType="begin"/>
+            </w:r>
+            <w:r>
+              <w:rPr>
+                <w:noProof/>
+              </w:rPr>
               <w:instrText xml:space="preserve"> PAGEREF _Toc226195267 \h </w:instrText>
+            </w:r>
+            <w:r>
+              <w:rPr>
+                <w:noProof/>
+              </w:rPr>
+            </w:r>
+            <w:r>
+              <w:rPr>
+                <w:noProof/>
+              </w:rPr>
               <w:fldChar w:fldCharType="separate"/>
+            </w:r>
+            <w:r>
+              <w:rPr>
+                <w:noProof/>
+              </w:rPr>
               <w:t>9</w:t>
+            </w:r>
+            <w:r>
+              <w:rPr>
+                <w:noProof/>
+              </w:rPr>
               <w:fldChar w:fldCharType="end"/>
             </w:r>
           </w:hyperlink>
@@ -1422,10 +1996,40 @@
                 <w:noProof/>
               </w:rPr>
               <w:tab/>
+            </w:r>
+            <w:r>
+              <w:rPr>
+                <w:noProof/>
+              </w:rPr>
               <w:fldChar w:fldCharType="begin"/>
+            </w:r>
+            <w:r>
+              <w:rPr>
+                <w:noProof/>
+              </w:rPr>
               <w:instrText xml:space="preserve"> PAGEREF _Toc226195268 \h </w:instrText>
+            </w:r>
+            <w:r>
+              <w:rPr>
+                <w:noProof/>
+              </w:rPr>
+            </w:r>
+            <w:r>
+              <w:rPr>
+                <w:noProof/>
+              </w:rPr>
               <w:fldChar w:fldCharType="separate"/>
+            </w:r>
+            <w:r>
+              <w:rPr>
+                <w:noProof/>
+              </w:rPr>
               <w:t>9</w:t>
+            </w:r>
+            <w:r>
+              <w:rPr>
+                <w:noProof/>
+              </w:rPr>
               <w:fldChar w:fldCharType="end"/>
             </w:r>
           </w:hyperlink>
@@ -1453,10 +2057,40 @@
                 <w:noProof/>
               </w:rPr>
               <w:tab/>
+            </w:r>
+            <w:r>
+              <w:rPr>
+                <w:noProof/>
+              </w:rPr>
               <w:fldChar w:fldCharType="begin"/>
+            </w:r>
+            <w:r>
+              <w:rPr>
+                <w:noProof/>
+              </w:rPr>
               <w:instrText xml:space="preserve"> PAGEREF _Toc226195269 \h </w:instrText>
+            </w:r>
+            <w:r>
+              <w:rPr>
+                <w:noProof/>
+              </w:rPr>
+            </w:r>
+            <w:r>
+              <w:rPr>
+                <w:noProof/>
+              </w:rPr>
               <w:fldChar w:fldCharType="separate"/>
+            </w:r>
+            <w:r>
+              <w:rPr>
+                <w:noProof/>
+              </w:rPr>
               <w:t>9</w:t>
+            </w:r>
+            <w:r>
+              <w:rPr>
+                <w:noProof/>
+              </w:rPr>
               <w:fldChar w:fldCharType="end"/>
             </w:r>
           </w:hyperlink>
@@ -1484,10 +2118,40 @@
                 <w:noProof/>
               </w:rPr>
               <w:tab/>
+            </w:r>
+            <w:r>
+              <w:rPr>
+                <w:noProof/>
+              </w:rPr>
               <w:fldChar w:fldCharType="begin"/>
+            </w:r>
+            <w:r>
+              <w:rPr>
+                <w:noProof/>
+              </w:rPr>
               <w:instrText xml:space="preserve"> PAGEREF _Toc226195270 \h </w:instrText>
+            </w:r>
+            <w:r>
+              <w:rPr>
+                <w:noProof/>
+              </w:rPr>
+            </w:r>
+            <w:r>
+              <w:rPr>
+                <w:noProof/>
+              </w:rPr>
               <w:fldChar w:fldCharType="separate"/>
+            </w:r>
+            <w:r>
+              <w:rPr>
+                <w:noProof/>
+              </w:rPr>
               <w:t>10</w:t>
+            </w:r>
+            <w:r>
+              <w:rPr>
+                <w:noProof/>
+              </w:rPr>
               <w:fldChar w:fldCharType="end"/>
             </w:r>
           </w:hyperlink>
@@ -1515,10 +2179,40 @@
                 <w:noProof/>
               </w:rPr>
               <w:tab/>
+            </w:r>
+            <w:r>
+              <w:rPr>
+                <w:noProof/>
+              </w:rPr>
               <w:fldChar w:fldCharType="begin"/>
+            </w:r>
+            <w:r>
+              <w:rPr>
+                <w:noProof/>
+              </w:rPr>
               <w:instrText xml:space="preserve"> PAGEREF _Toc226195271 \h </w:instrText>
+            </w:r>
+            <w:r>
+              <w:rPr>
+                <w:noProof/>
+              </w:rPr>
+            </w:r>
+            <w:r>
+              <w:rPr>
+                <w:noProof/>
+              </w:rPr>
               <w:fldChar w:fldCharType="separate"/>
+            </w:r>
+            <w:r>
+              <w:rPr>
+                <w:noProof/>
+              </w:rPr>
               <w:t>11</w:t>
+            </w:r>
+            <w:r>
+              <w:rPr>
+                <w:noProof/>
+              </w:rPr>
               <w:fldChar w:fldCharType="end"/>
             </w:r>
           </w:hyperlink>
@@ -1546,10 +2240,40 @@
                 <w:noProof/>
               </w:rPr>
               <w:tab/>
+            </w:r>
+            <w:r>
+              <w:rPr>
+                <w:noProof/>
+              </w:rPr>
               <w:fldChar w:fldCharType="begin"/>
+            </w:r>
+            <w:r>
+              <w:rPr>
+                <w:noProof/>
+              </w:rPr>
               <w:instrText xml:space="preserve"> PAGEREF _Toc226195272 \h </w:instrText>
+            </w:r>
+            <w:r>
+              <w:rPr>
+                <w:noProof/>
+              </w:rPr>
+            </w:r>
+            <w:r>
+              <w:rPr>
+                <w:noProof/>
+              </w:rPr>
               <w:fldChar w:fldCharType="separate"/>
+            </w:r>
+            <w:r>
+              <w:rPr>
+                <w:noProof/>
+              </w:rPr>
               <w:t>11</w:t>
+            </w:r>
+            <w:r>
+              <w:rPr>
+                <w:noProof/>
+              </w:rPr>
               <w:fldChar w:fldCharType="end"/>
             </w:r>
           </w:hyperlink>
@@ -1577,10 +2301,40 @@
                 <w:noProof/>
               </w:rPr>
               <w:tab/>
+            </w:r>
+            <w:r>
+              <w:rPr>
+                <w:noProof/>
+              </w:rPr>
               <w:fldChar w:fldCharType="begin"/>
+            </w:r>
+            <w:r>
+              <w:rPr>
+                <w:noProof/>
+              </w:rPr>
               <w:instrText xml:space="preserve"> PAGEREF _Toc226195273 \h </w:instrText>
+            </w:r>
+            <w:r>
+              <w:rPr>
+                <w:noProof/>
+              </w:rPr>
+            </w:r>
+            <w:r>
+              <w:rPr>
+                <w:noProof/>
+              </w:rPr>
               <w:fldChar w:fldCharType="separate"/>
+            </w:r>
+            <w:r>
+              <w:rPr>
+                <w:noProof/>
+              </w:rPr>
               <w:t>11</w:t>
+            </w:r>
+            <w:r>
+              <w:rPr>
+                <w:noProof/>
+              </w:rPr>
               <w:fldChar w:fldCharType="end"/>
             </w:r>
           </w:hyperlink>
@@ -1608,10 +2362,40 @@
                 <w:noProof/>
               </w:rPr>
               <w:tab/>
+            </w:r>
+            <w:r>
+              <w:rPr>
+                <w:noProof/>
+              </w:rPr>
               <w:fldChar w:fldCharType="begin"/>
+            </w:r>
+            <w:r>
+              <w:rPr>
+                <w:noProof/>
+              </w:rPr>
               <w:instrText xml:space="preserve"> PAGEREF _Toc226195274 \h </w:instrText>
+            </w:r>
+            <w:r>
+              <w:rPr>
+                <w:noProof/>
+              </w:rPr>
+            </w:r>
+            <w:r>
+              <w:rPr>
+                <w:noProof/>
+              </w:rPr>
               <w:fldChar w:fldCharType="separate"/>
+            </w:r>
+            <w:r>
+              <w:rPr>
+                <w:noProof/>
+              </w:rPr>
               <w:t>11</w:t>
+            </w:r>
+            <w:r>
+              <w:rPr>
+                <w:noProof/>
+              </w:rPr>
               <w:fldChar w:fldCharType="end"/>
             </w:r>
           </w:hyperlink>
@@ -1639,10 +2423,40 @@
                 <w:noProof/>
               </w:rPr>
               <w:tab/>
+            </w:r>
+            <w:r>
+              <w:rPr>
+                <w:noProof/>
+              </w:rPr>
               <w:fldChar w:fldCharType="begin"/>
+            </w:r>
+            <w:r>
+              <w:rPr>
+                <w:noProof/>
+              </w:rPr>
               <w:instrText xml:space="preserve"> PAGEREF _Toc226195290 \h </w:instrText>
+            </w:r>
+            <w:r>
+              <w:rPr>
+                <w:noProof/>
+              </w:rPr>
+            </w:r>
+            <w:r>
+              <w:rPr>
+                <w:noProof/>
+              </w:rPr>
               <w:fldChar w:fldCharType="separate"/>
-              <w:t>11</w:t>
+            </w:r>
+            <w:r>
+              <w:rPr>
+                <w:noProof/>
+              </w:rPr>
+              <w:t>17</w:t>
+            </w:r>
+            <w:r>
+              <w:rPr>
+                <w:noProof/>
+              </w:rPr>
               <w:fldChar w:fldCharType="end"/>
             </w:r>
           </w:hyperlink>
@@ -1670,10 +2484,40 @@
                 <w:noProof/>
               </w:rPr>
               <w:tab/>
+            </w:r>
+            <w:r>
+              <w:rPr>
+                <w:noProof/>
+              </w:rPr>
               <w:fldChar w:fldCharType="begin"/>
+            </w:r>
+            <w:r>
+              <w:rPr>
+                <w:noProof/>
+              </w:rPr>
               <w:instrText xml:space="preserve"> PAGEREF _Toc226195291 \h </w:instrText>
+            </w:r>
+            <w:r>
+              <w:rPr>
+                <w:noProof/>
+              </w:rPr>
+            </w:r>
+            <w:r>
+              <w:rPr>
+                <w:noProof/>
+              </w:rPr>
               <w:fldChar w:fldCharType="separate"/>
-              <w:t>11</w:t>
+            </w:r>
+            <w:r>
+              <w:rPr>
+                <w:noProof/>
+              </w:rPr>
+              <w:t>17</w:t>
+            </w:r>
+            <w:r>
+              <w:rPr>
+                <w:noProof/>
+              </w:rPr>
               <w:fldChar w:fldCharType="end"/>
             </w:r>
           </w:hyperlink>
@@ -1701,10 +2545,40 @@
                 <w:noProof/>
               </w:rPr>
               <w:tab/>
+            </w:r>
+            <w:r>
+              <w:rPr>
+                <w:noProof/>
+              </w:rPr>
               <w:fldChar w:fldCharType="begin"/>
+            </w:r>
+            <w:r>
+              <w:rPr>
+                <w:noProof/>
+              </w:rPr>
               <w:instrText xml:space="preserve"> PAGEREF _Toc226195276 \h </w:instrText>
+            </w:r>
+            <w:r>
+              <w:rPr>
+                <w:noProof/>
+              </w:rPr>
+            </w:r>
+            <w:r>
+              <w:rPr>
+                <w:noProof/>
+              </w:rPr>
               <w:fldChar w:fldCharType="separate"/>
-              <w:t>11</w:t>
+            </w:r>
+            <w:r>
+              <w:rPr>
+                <w:noProof/>
+              </w:rPr>
+              <w:t>14</w:t>
+            </w:r>
+            <w:r>
+              <w:rPr>
+                <w:noProof/>
+              </w:rPr>
               <w:fldChar w:fldCharType="end"/>
             </w:r>
           </w:hyperlink>
@@ -1732,10 +2606,40 @@
                 <w:noProof/>
               </w:rPr>
               <w:tab/>
+            </w:r>
+            <w:r>
+              <w:rPr>
+                <w:noProof/>
+              </w:rPr>
               <w:fldChar w:fldCharType="begin"/>
+            </w:r>
+            <w:r>
+              <w:rPr>
+                <w:noProof/>
+              </w:rPr>
               <w:instrText xml:space="preserve"> PAGEREF _Toc226195277 \h </w:instrText>
+            </w:r>
+            <w:r>
+              <w:rPr>
+                <w:noProof/>
+              </w:rPr>
+            </w:r>
+            <w:r>
+              <w:rPr>
+                <w:noProof/>
+              </w:rPr>
               <w:fldChar w:fldCharType="separate"/>
-              <w:t>11</w:t>
+            </w:r>
+            <w:r>
+              <w:rPr>
+                <w:noProof/>
+              </w:rPr>
+              <w:t>14</w:t>
+            </w:r>
+            <w:r>
+              <w:rPr>
+                <w:noProof/>
+              </w:rPr>
               <w:fldChar w:fldCharType="end"/>
             </w:r>
           </w:hyperlink>
@@ -1763,10 +2667,40 @@
                 <w:noProof/>
               </w:rPr>
               <w:tab/>
+            </w:r>
+            <w:r>
+              <w:rPr>
+                <w:noProof/>
+              </w:rPr>
               <w:fldChar w:fldCharType="begin"/>
+            </w:r>
+            <w:r>
+              <w:rPr>
+                <w:noProof/>
+              </w:rPr>
               <w:instrText xml:space="preserve"> PAGEREF _Toc226195278 \h </w:instrText>
+            </w:r>
+            <w:r>
+              <w:rPr>
+                <w:noProof/>
+              </w:rPr>
+            </w:r>
+            <w:r>
+              <w:rPr>
+                <w:noProof/>
+              </w:rPr>
               <w:fldChar w:fldCharType="separate"/>
-              <w:t>11</w:t>
+            </w:r>
+            <w:r>
+              <w:rPr>
+                <w:noProof/>
+              </w:rPr>
+              <w:t>14</w:t>
+            </w:r>
+            <w:r>
+              <w:rPr>
+                <w:noProof/>
+              </w:rPr>
               <w:fldChar w:fldCharType="end"/>
             </w:r>
           </w:hyperlink>
@@ -1794,10 +2728,40 @@
                 <w:noProof/>
               </w:rPr>
               <w:tab/>
+            </w:r>
+            <w:r>
+              <w:rPr>
+                <w:noProof/>
+              </w:rPr>
               <w:fldChar w:fldCharType="begin"/>
+            </w:r>
+            <w:r>
+              <w:rPr>
+                <w:noProof/>
+              </w:rPr>
               <w:instrText xml:space="preserve"> PAGEREF _Toc226195279 \h </w:instrText>
+            </w:r>
+            <w:r>
+              <w:rPr>
+                <w:noProof/>
+              </w:rPr>
+            </w:r>
+            <w:r>
+              <w:rPr>
+                <w:noProof/>
+              </w:rPr>
               <w:fldChar w:fldCharType="separate"/>
-              <w:t>11</w:t>
+            </w:r>
+            <w:r>
+              <w:rPr>
+                <w:noProof/>
+              </w:rPr>
+              <w:t>14</w:t>
+            </w:r>
+            <w:r>
+              <w:rPr>
+                <w:noProof/>
+              </w:rPr>
               <w:fldChar w:fldCharType="end"/>
             </w:r>
           </w:hyperlink>
@@ -1825,10 +2789,40 @@
                 <w:noProof/>
               </w:rPr>
               <w:tab/>
+            </w:r>
+            <w:r>
+              <w:rPr>
+                <w:noProof/>
+              </w:rPr>
               <w:fldChar w:fldCharType="begin"/>
+            </w:r>
+            <w:r>
+              <w:rPr>
+                <w:noProof/>
+              </w:rPr>
               <w:instrText xml:space="preserve"> PAGEREF _Toc226195280 \h </w:instrText>
+            </w:r>
+            <w:r>
+              <w:rPr>
+                <w:noProof/>
+              </w:rPr>
+            </w:r>
+            <w:r>
+              <w:rPr>
+                <w:noProof/>
+              </w:rPr>
               <w:fldChar w:fldCharType="separate"/>
-              <w:t>12</w:t>
+            </w:r>
+            <w:r>
+              <w:rPr>
+                <w:noProof/>
+              </w:rPr>
+              <w:t>14</w:t>
+            </w:r>
+            <w:r>
+              <w:rPr>
+                <w:noProof/>
+              </w:rPr>
               <w:fldChar w:fldCharType="end"/>
             </w:r>
           </w:hyperlink>
@@ -1856,10 +2850,40 @@
                 <w:noProof/>
               </w:rPr>
               <w:tab/>
+            </w:r>
+            <w:r>
+              <w:rPr>
+                <w:noProof/>
+              </w:rPr>
               <w:fldChar w:fldCharType="begin"/>
+            </w:r>
+            <w:r>
+              <w:rPr>
+                <w:noProof/>
+              </w:rPr>
               <w:instrText xml:space="preserve"> PAGEREF _Toc226195281 \h </w:instrText>
+            </w:r>
+            <w:r>
+              <w:rPr>
+                <w:noProof/>
+              </w:rPr>
+            </w:r>
+            <w:r>
+              <w:rPr>
+                <w:noProof/>
+              </w:rPr>
               <w:fldChar w:fldCharType="separate"/>
-              <w:t>12</w:t>
+            </w:r>
+            <w:r>
+              <w:rPr>
+                <w:noProof/>
+              </w:rPr>
+              <w:t>15</w:t>
+            </w:r>
+            <w:r>
+              <w:rPr>
+                <w:noProof/>
+              </w:rPr>
               <w:fldChar w:fldCharType="end"/>
             </w:r>
           </w:hyperlink>
@@ -1887,10 +2911,40 @@
                 <w:noProof/>
               </w:rPr>
               <w:tab/>
+            </w:r>
+            <w:r>
+              <w:rPr>
+                <w:noProof/>
+              </w:rPr>
               <w:fldChar w:fldCharType="begin"/>
+            </w:r>
+            <w:r>
+              <w:rPr>
+                <w:noProof/>
+              </w:rPr>
               <w:instrText xml:space="preserve"> PAGEREF _Toc226195282 \h </w:instrText>
+            </w:r>
+            <w:r>
+              <w:rPr>
+                <w:noProof/>
+              </w:rPr>
+            </w:r>
+            <w:r>
+              <w:rPr>
+                <w:noProof/>
+              </w:rPr>
               <w:fldChar w:fldCharType="separate"/>
-              <w:t>12</w:t>
+            </w:r>
+            <w:r>
+              <w:rPr>
+                <w:noProof/>
+              </w:rPr>
+              <w:t>15</w:t>
+            </w:r>
+            <w:r>
+              <w:rPr>
+                <w:noProof/>
+              </w:rPr>
               <w:fldChar w:fldCharType="end"/>
             </w:r>
           </w:hyperlink>
@@ -1918,10 +2972,40 @@
                 <w:noProof/>
               </w:rPr>
               <w:tab/>
+            </w:r>
+            <w:r>
+              <w:rPr>
+                <w:noProof/>
+              </w:rPr>
               <w:fldChar w:fldCharType="begin"/>
+            </w:r>
+            <w:r>
+              <w:rPr>
+                <w:noProof/>
+              </w:rPr>
               <w:instrText xml:space="preserve"> PAGEREF _Toc226195283 \h </w:instrText>
+            </w:r>
+            <w:r>
+              <w:rPr>
+                <w:noProof/>
+              </w:rPr>
+            </w:r>
+            <w:r>
+              <w:rPr>
+                <w:noProof/>
+              </w:rPr>
               <w:fldChar w:fldCharType="separate"/>
-              <w:t>13</w:t>
+            </w:r>
+            <w:r>
+              <w:rPr>
+                <w:noProof/>
+              </w:rPr>
+              <w:t>16</w:t>
+            </w:r>
+            <w:r>
+              <w:rPr>
+                <w:noProof/>
+              </w:rPr>
               <w:fldChar w:fldCharType="end"/>
             </w:r>
           </w:hyperlink>
@@ -1949,10 +3033,40 @@
                 <w:noProof/>
               </w:rPr>
               <w:tab/>
+            </w:r>
+            <w:r>
+              <w:rPr>
+                <w:noProof/>
+              </w:rPr>
               <w:fldChar w:fldCharType="begin"/>
+            </w:r>
+            <w:r>
+              <w:rPr>
+                <w:noProof/>
+              </w:rPr>
               <w:instrText xml:space="preserve"> PAGEREF _Toc226195284 \h </w:instrText>
+            </w:r>
+            <w:r>
+              <w:rPr>
+                <w:noProof/>
+              </w:rPr>
+            </w:r>
+            <w:r>
+              <w:rPr>
+                <w:noProof/>
+              </w:rPr>
               <w:fldChar w:fldCharType="separate"/>
-              <w:t>13</w:t>
+            </w:r>
+            <w:r>
+              <w:rPr>
+                <w:noProof/>
+              </w:rPr>
+              <w:t>16</w:t>
+            </w:r>
+            <w:r>
+              <w:rPr>
+                <w:noProof/>
+              </w:rPr>
               <w:fldChar w:fldCharType="end"/>
             </w:r>
           </w:hyperlink>
@@ -1980,10 +3094,40 @@
                 <w:noProof/>
               </w:rPr>
               <w:tab/>
+            </w:r>
+            <w:r>
+              <w:rPr>
+                <w:noProof/>
+              </w:rPr>
               <w:fldChar w:fldCharType="begin"/>
+            </w:r>
+            <w:r>
+              <w:rPr>
+                <w:noProof/>
+              </w:rPr>
               <w:instrText xml:space="preserve"> PAGEREF _Toc226195285 \h </w:instrText>
+            </w:r>
+            <w:r>
+              <w:rPr>
+                <w:noProof/>
+              </w:rPr>
+            </w:r>
+            <w:r>
+              <w:rPr>
+                <w:noProof/>
+              </w:rPr>
               <w:fldChar w:fldCharType="separate"/>
-              <w:t>13</w:t>
+            </w:r>
+            <w:r>
+              <w:rPr>
+                <w:noProof/>
+              </w:rPr>
+              <w:t>16</w:t>
+            </w:r>
+            <w:r>
+              <w:rPr>
+                <w:noProof/>
+              </w:rPr>
               <w:fldChar w:fldCharType="end"/>
             </w:r>
           </w:hyperlink>
@@ -2011,10 +3155,40 @@
                 <w:noProof/>
               </w:rPr>
               <w:tab/>
+            </w:r>
+            <w:r>
+              <w:rPr>
+                <w:noProof/>
+              </w:rPr>
               <w:fldChar w:fldCharType="begin"/>
+            </w:r>
+            <w:r>
+              <w:rPr>
+                <w:noProof/>
+              </w:rPr>
               <w:instrText xml:space="preserve"> PAGEREF _Toc226195286 \h </w:instrText>
+            </w:r>
+            <w:r>
+              <w:rPr>
+                <w:noProof/>
+              </w:rPr>
+            </w:r>
+            <w:r>
+              <w:rPr>
+                <w:noProof/>
+              </w:rPr>
               <w:fldChar w:fldCharType="separate"/>
-              <w:t>13</w:t>
+            </w:r>
+            <w:r>
+              <w:rPr>
+                <w:noProof/>
+              </w:rPr>
+              <w:t>16</w:t>
+            </w:r>
+            <w:r>
+              <w:rPr>
+                <w:noProof/>
+              </w:rPr>
               <w:fldChar w:fldCharType="end"/>
             </w:r>
           </w:hyperlink>
@@ -2042,10 +3216,40 @@
                 <w:noProof/>
               </w:rPr>
               <w:tab/>
+            </w:r>
+            <w:r>
+              <w:rPr>
+                <w:noProof/>
+              </w:rPr>
               <w:fldChar w:fldCharType="begin"/>
+            </w:r>
+            <w:r>
+              <w:rPr>
+                <w:noProof/>
+              </w:rPr>
               <w:instrText xml:space="preserve"> PAGEREF _Toc226195287 \h </w:instrText>
+            </w:r>
+            <w:r>
+              <w:rPr>
+                <w:noProof/>
+              </w:rPr>
+            </w:r>
+            <w:r>
+              <w:rPr>
+                <w:noProof/>
+              </w:rPr>
               <w:fldChar w:fldCharType="separate"/>
-              <w:t>14</w:t>
+            </w:r>
+            <w:r>
+              <w:rPr>
+                <w:noProof/>
+              </w:rPr>
+              <w:t>17</w:t>
+            </w:r>
+            <w:r>
+              <w:rPr>
+                <w:noProof/>
+              </w:rPr>
               <w:fldChar w:fldCharType="end"/>
             </w:r>
           </w:hyperlink>
@@ -2073,10 +3277,40 @@
                 <w:noProof/>
               </w:rPr>
               <w:tab/>
+            </w:r>
+            <w:r>
+              <w:rPr>
+                <w:noProof/>
+              </w:rPr>
               <w:fldChar w:fldCharType="begin"/>
+            </w:r>
+            <w:r>
+              <w:rPr>
+                <w:noProof/>
+              </w:rPr>
               <w:instrText xml:space="preserve"> PAGEREF _Toc226195288 \h </w:instrText>
+            </w:r>
+            <w:r>
+              <w:rPr>
+                <w:noProof/>
+              </w:rPr>
+            </w:r>
+            <w:r>
+              <w:rPr>
+                <w:noProof/>
+              </w:rPr>
               <w:fldChar w:fldCharType="separate"/>
-              <w:t>14</w:t>
+            </w:r>
+            <w:r>
+              <w:rPr>
+                <w:noProof/>
+              </w:rPr>
+              <w:t>17</w:t>
+            </w:r>
+            <w:r>
+              <w:rPr>
+                <w:noProof/>
+              </w:rPr>
               <w:fldChar w:fldCharType="end"/>
             </w:r>
           </w:hyperlink>
@@ -2104,10 +3338,40 @@
                 <w:noProof/>
               </w:rPr>
               <w:tab/>
+            </w:r>
+            <w:r>
+              <w:rPr>
+                <w:noProof/>
+              </w:rPr>
               <w:fldChar w:fldCharType="begin"/>
+            </w:r>
+            <w:r>
+              <w:rPr>
+                <w:noProof/>
+              </w:rPr>
               <w:instrText xml:space="preserve"> PAGEREF _Toc226195289 \h </w:instrText>
+            </w:r>
+            <w:r>
+              <w:rPr>
+                <w:noProof/>
+              </w:rPr>
+            </w:r>
+            <w:r>
+              <w:rPr>
+                <w:noProof/>
+              </w:rPr>
               <w:fldChar w:fldCharType="separate"/>
-              <w:t>14</w:t>
+            </w:r>
+            <w:r>
+              <w:rPr>
+                <w:noProof/>
+              </w:rPr>
+              <w:t>17</w:t>
+            </w:r>
+            <w:r>
+              <w:rPr>
+                <w:noProof/>
+              </w:rPr>
               <w:fldChar w:fldCharType="end"/>
             </w:r>
           </w:hyperlink>
@@ -2135,10 +3399,40 @@
                 <w:noProof/>
               </w:rPr>
               <w:tab/>
+            </w:r>
+            <w:r>
+              <w:rPr>
+                <w:noProof/>
+              </w:rPr>
               <w:fldChar w:fldCharType="begin"/>
+            </w:r>
+            <w:r>
+              <w:rPr>
+                <w:noProof/>
+              </w:rPr>
               <w:instrText xml:space="preserve"> PAGEREF _Toc226195290 \h </w:instrText>
+            </w:r>
+            <w:r>
+              <w:rPr>
+                <w:noProof/>
+              </w:rPr>
+            </w:r>
+            <w:r>
+              <w:rPr>
+                <w:noProof/>
+              </w:rPr>
               <w:fldChar w:fldCharType="separate"/>
-              <w:t>14</w:t>
+            </w:r>
+            <w:r>
+              <w:rPr>
+                <w:noProof/>
+              </w:rPr>
+              <w:t>17</w:t>
+            </w:r>
+            <w:r>
+              <w:rPr>
+                <w:noProof/>
+              </w:rPr>
               <w:fldChar w:fldCharType="end"/>
             </w:r>
           </w:hyperlink>
@@ -2166,10 +3460,40 @@
                 <w:noProof/>
               </w:rPr>
               <w:tab/>
+            </w:r>
+            <w:r>
+              <w:rPr>
+                <w:noProof/>
+              </w:rPr>
               <w:fldChar w:fldCharType="begin"/>
+            </w:r>
+            <w:r>
+              <w:rPr>
+                <w:noProof/>
+              </w:rPr>
               <w:instrText xml:space="preserve"> PAGEREF _Toc226195291 \h </w:instrText>
+            </w:r>
+            <w:r>
+              <w:rPr>
+                <w:noProof/>
+              </w:rPr>
+            </w:r>
+            <w:r>
+              <w:rPr>
+                <w:noProof/>
+              </w:rPr>
               <w:fldChar w:fldCharType="separate"/>
-              <w:t>14</w:t>
+            </w:r>
+            <w:r>
+              <w:rPr>
+                <w:noProof/>
+              </w:rPr>
+              <w:t>17</w:t>
+            </w:r>
+            <w:r>
+              <w:rPr>
+                <w:noProof/>
+              </w:rPr>
               <w:fldChar w:fldCharType="end"/>
             </w:r>
           </w:hyperlink>
@@ -2197,10 +3521,40 @@
                 <w:noProof/>
               </w:rPr>
               <w:tab/>
+            </w:r>
+            <w:r>
+              <w:rPr>
+                <w:noProof/>
+              </w:rPr>
               <w:fldChar w:fldCharType="begin"/>
+            </w:r>
+            <w:r>
+              <w:rPr>
+                <w:noProof/>
+              </w:rPr>
               <w:instrText xml:space="preserve"> PAGEREF _Toc226195292 \h </w:instrText>
+            </w:r>
+            <w:r>
+              <w:rPr>
+                <w:noProof/>
+              </w:rPr>
+            </w:r>
+            <w:r>
+              <w:rPr>
+                <w:noProof/>
+              </w:rPr>
               <w:fldChar w:fldCharType="separate"/>
-              <w:t>14</w:t>
+            </w:r>
+            <w:r>
+              <w:rPr>
+                <w:noProof/>
+              </w:rPr>
+              <w:t>17</w:t>
+            </w:r>
+            <w:r>
+              <w:rPr>
+                <w:noProof/>
+              </w:rPr>
               <w:fldChar w:fldCharType="end"/>
             </w:r>
           </w:hyperlink>
@@ -2228,10 +3582,40 @@
                 <w:noProof/>
               </w:rPr>
               <w:tab/>
+            </w:r>
+            <w:r>
+              <w:rPr>
+                <w:noProof/>
+              </w:rPr>
               <w:fldChar w:fldCharType="begin"/>
+            </w:r>
+            <w:r>
+              <w:rPr>
+                <w:noProof/>
+              </w:rPr>
               <w:instrText xml:space="preserve"> PAGEREF _Toc226195293 \h </w:instrText>
+            </w:r>
+            <w:r>
+              <w:rPr>
+                <w:noProof/>
+              </w:rPr>
+            </w:r>
+            <w:r>
+              <w:rPr>
+                <w:noProof/>
+              </w:rPr>
               <w:fldChar w:fldCharType="separate"/>
-              <w:t>14</w:t>
+            </w:r>
+            <w:r>
+              <w:rPr>
+                <w:noProof/>
+              </w:rPr>
+              <w:t>17</w:t>
+            </w:r>
+            <w:r>
+              <w:rPr>
+                <w:noProof/>
+              </w:rPr>
               <w:fldChar w:fldCharType="end"/>
             </w:r>
           </w:hyperlink>
@@ -2259,10 +3643,40 @@
                 <w:noProof/>
               </w:rPr>
               <w:tab/>
+            </w:r>
+            <w:r>
+              <w:rPr>
+                <w:noProof/>
+              </w:rPr>
               <w:fldChar w:fldCharType="begin"/>
+            </w:r>
+            <w:r>
+              <w:rPr>
+                <w:noProof/>
+              </w:rPr>
               <w:instrText xml:space="preserve"> PAGEREF _Toc226195294 \h </w:instrText>
+            </w:r>
+            <w:r>
+              <w:rPr>
+                <w:noProof/>
+              </w:rPr>
+            </w:r>
+            <w:r>
+              <w:rPr>
+                <w:noProof/>
+              </w:rPr>
               <w:fldChar w:fldCharType="separate"/>
-              <w:t>14</w:t>
+            </w:r>
+            <w:r>
+              <w:rPr>
+                <w:noProof/>
+              </w:rPr>
+              <w:t>17</w:t>
+            </w:r>
+            <w:r>
+              <w:rPr>
+                <w:noProof/>
+              </w:rPr>
               <w:fldChar w:fldCharType="end"/>
             </w:r>
           </w:hyperlink>
@@ -2290,10 +3704,40 @@
                 <w:noProof/>
               </w:rPr>
               <w:tab/>
+            </w:r>
+            <w:r>
+              <w:rPr>
+                <w:noProof/>
+              </w:rPr>
               <w:fldChar w:fldCharType="begin"/>
+            </w:r>
+            <w:r>
+              <w:rPr>
+                <w:noProof/>
+              </w:rPr>
               <w:instrText xml:space="preserve"> PAGEREF _Toc226195295 \h </w:instrText>
+            </w:r>
+            <w:r>
+              <w:rPr>
+                <w:noProof/>
+              </w:rPr>
+            </w:r>
+            <w:r>
+              <w:rPr>
+                <w:noProof/>
+              </w:rPr>
               <w:fldChar w:fldCharType="separate"/>
-              <w:t>14</w:t>
+            </w:r>
+            <w:r>
+              <w:rPr>
+                <w:noProof/>
+              </w:rPr>
+              <w:t>17</w:t>
+            </w:r>
+            <w:r>
+              <w:rPr>
+                <w:noProof/>
+              </w:rPr>
               <w:fldChar w:fldCharType="end"/>
             </w:r>
           </w:hyperlink>
@@ -2321,10 +3765,40 @@
                 <w:noProof/>
               </w:rPr>
               <w:tab/>
+            </w:r>
+            <w:r>
+              <w:rPr>
+                <w:noProof/>
+              </w:rPr>
               <w:fldChar w:fldCharType="begin"/>
+            </w:r>
+            <w:r>
+              <w:rPr>
+                <w:noProof/>
+              </w:rPr>
               <w:instrText xml:space="preserve"> PAGEREF _Toc226195296 \h </w:instrText>
+            </w:r>
+            <w:r>
+              <w:rPr>
+                <w:noProof/>
+              </w:rPr>
+            </w:r>
+            <w:r>
+              <w:rPr>
+                <w:noProof/>
+              </w:rPr>
               <w:fldChar w:fldCharType="separate"/>
-              <w:t>14</w:t>
+            </w:r>
+            <w:r>
+              <w:rPr>
+                <w:noProof/>
+              </w:rPr>
+              <w:t>18</w:t>
+            </w:r>
+            <w:r>
+              <w:rPr>
+                <w:noProof/>
+              </w:rPr>
               <w:fldChar w:fldCharType="end"/>
             </w:r>
           </w:hyperlink>
@@ -2352,10 +3826,40 @@
                 <w:noProof/>
               </w:rPr>
               <w:tab/>
+            </w:r>
+            <w:r>
+              <w:rPr>
+                <w:noProof/>
+              </w:rPr>
               <w:fldChar w:fldCharType="begin"/>
+            </w:r>
+            <w:r>
+              <w:rPr>
+                <w:noProof/>
+              </w:rPr>
               <w:instrText xml:space="preserve"> PAGEREF _Toc226195297 \h </w:instrText>
+            </w:r>
+            <w:r>
+              <w:rPr>
+                <w:noProof/>
+              </w:rPr>
+            </w:r>
+            <w:r>
+              <w:rPr>
+                <w:noProof/>
+              </w:rPr>
               <w:fldChar w:fldCharType="separate"/>
-              <w:t>15</w:t>
+            </w:r>
+            <w:r>
+              <w:rPr>
+                <w:noProof/>
+              </w:rPr>
+              <w:t>18</w:t>
+            </w:r>
+            <w:r>
+              <w:rPr>
+                <w:noProof/>
+              </w:rPr>
               <w:fldChar w:fldCharType="end"/>
             </w:r>
           </w:hyperlink>
@@ -2383,10 +3887,40 @@
                 <w:noProof/>
               </w:rPr>
               <w:tab/>
+            </w:r>
+            <w:r>
+              <w:rPr>
+                <w:noProof/>
+              </w:rPr>
               <w:fldChar w:fldCharType="begin"/>
+            </w:r>
+            <w:r>
+              <w:rPr>
+                <w:noProof/>
+              </w:rPr>
               <w:instrText xml:space="preserve"> PAGEREF _Toc226195298 \h </w:instrText>
+            </w:r>
+            <w:r>
+              <w:rPr>
+                <w:noProof/>
+              </w:rPr>
+            </w:r>
+            <w:r>
+              <w:rPr>
+                <w:noProof/>
+              </w:rPr>
               <w:fldChar w:fldCharType="separate"/>
-              <w:t>16</w:t>
+            </w:r>
+            <w:r>
+              <w:rPr>
+                <w:noProof/>
+              </w:rPr>
+              <w:t>19</w:t>
+            </w:r>
+            <w:r>
+              <w:rPr>
+                <w:noProof/>
+              </w:rPr>
               <w:fldChar w:fldCharType="end"/>
             </w:r>
           </w:hyperlink>
@@ -2414,10 +3948,40 @@
                 <w:noProof/>
               </w:rPr>
               <w:tab/>
+            </w:r>
+            <w:r>
+              <w:rPr>
+                <w:noProof/>
+              </w:rPr>
               <w:fldChar w:fldCharType="begin"/>
+            </w:r>
+            <w:r>
+              <w:rPr>
+                <w:noProof/>
+              </w:rPr>
               <w:instrText xml:space="preserve"> PAGEREF _Toc226195299 \h </w:instrText>
+            </w:r>
+            <w:r>
+              <w:rPr>
+                <w:noProof/>
+              </w:rPr>
+            </w:r>
+            <w:r>
+              <w:rPr>
+                <w:noProof/>
+              </w:rPr>
               <w:fldChar w:fldCharType="separate"/>
-              <w:t>16</w:t>
+            </w:r>
+            <w:r>
+              <w:rPr>
+                <w:noProof/>
+              </w:rPr>
+              <w:t>19</w:t>
+            </w:r>
+            <w:r>
+              <w:rPr>
+                <w:noProof/>
+              </w:rPr>
               <w:fldChar w:fldCharType="end"/>
             </w:r>
           </w:hyperlink>
@@ -2445,10 +4009,40 @@
                 <w:noProof/>
               </w:rPr>
               <w:tab/>
+            </w:r>
+            <w:r>
+              <w:rPr>
+                <w:noProof/>
+              </w:rPr>
               <w:fldChar w:fldCharType="begin"/>
+            </w:r>
+            <w:r>
+              <w:rPr>
+                <w:noProof/>
+              </w:rPr>
               <w:instrText xml:space="preserve"> PAGEREF _Toc226195300 \h </w:instrText>
+            </w:r>
+            <w:r>
+              <w:rPr>
+                <w:noProof/>
+              </w:rPr>
+            </w:r>
+            <w:r>
+              <w:rPr>
+                <w:noProof/>
+              </w:rPr>
               <w:fldChar w:fldCharType="separate"/>
-              <w:t>16</w:t>
+            </w:r>
+            <w:r>
+              <w:rPr>
+                <w:noProof/>
+              </w:rPr>
+              <w:t>19</w:t>
+            </w:r>
+            <w:r>
+              <w:rPr>
+                <w:noProof/>
+              </w:rPr>
               <w:fldChar w:fldCharType="end"/>
             </w:r>
           </w:hyperlink>
@@ -2476,10 +4070,40 @@
                 <w:noProof/>
               </w:rPr>
               <w:tab/>
+            </w:r>
+            <w:r>
+              <w:rPr>
+                <w:noProof/>
+              </w:rPr>
               <w:fldChar w:fldCharType="begin"/>
+            </w:r>
+            <w:r>
+              <w:rPr>
+                <w:noProof/>
+              </w:rPr>
               <w:instrText xml:space="preserve"> PAGEREF _Toc226195301 \h </w:instrText>
+            </w:r>
+            <w:r>
+              <w:rPr>
+                <w:noProof/>
+              </w:rPr>
+            </w:r>
+            <w:r>
+              <w:rPr>
+                <w:noProof/>
+              </w:rPr>
               <w:fldChar w:fldCharType="separate"/>
-              <w:t>16</w:t>
+            </w:r>
+            <w:r>
+              <w:rPr>
+                <w:noProof/>
+              </w:rPr>
+              <w:t>19</w:t>
+            </w:r>
+            <w:r>
+              <w:rPr>
+                <w:noProof/>
+              </w:rPr>
               <w:fldChar w:fldCharType="end"/>
             </w:r>
           </w:hyperlink>
@@ -2507,10 +4131,40 @@
                 <w:noProof/>
               </w:rPr>
               <w:tab/>
+            </w:r>
+            <w:r>
+              <w:rPr>
+                <w:noProof/>
+              </w:rPr>
               <w:fldChar w:fldCharType="begin"/>
+            </w:r>
+            <w:r>
+              <w:rPr>
+                <w:noProof/>
+              </w:rPr>
               <w:instrText xml:space="preserve"> PAGEREF _Toc226195302 \h </w:instrText>
+            </w:r>
+            <w:r>
+              <w:rPr>
+                <w:noProof/>
+              </w:rPr>
+            </w:r>
+            <w:r>
+              <w:rPr>
+                <w:noProof/>
+              </w:rPr>
               <w:fldChar w:fldCharType="separate"/>
-              <w:t>16</w:t>
+            </w:r>
+            <w:r>
+              <w:rPr>
+                <w:noProof/>
+              </w:rPr>
+              <w:t>19</w:t>
+            </w:r>
+            <w:r>
+              <w:rPr>
+                <w:noProof/>
+              </w:rPr>
               <w:fldChar w:fldCharType="end"/>
             </w:r>
           </w:hyperlink>
@@ -2538,10 +4192,40 @@
                 <w:noProof/>
               </w:rPr>
               <w:tab/>
+            </w:r>
+            <w:r>
+              <w:rPr>
+                <w:noProof/>
+              </w:rPr>
               <w:fldChar w:fldCharType="begin"/>
+            </w:r>
+            <w:r>
+              <w:rPr>
+                <w:noProof/>
+              </w:rPr>
               <w:instrText xml:space="preserve"> PAGEREF _Toc226195303 \h </w:instrText>
+            </w:r>
+            <w:r>
+              <w:rPr>
+                <w:noProof/>
+              </w:rPr>
+            </w:r>
+            <w:r>
+              <w:rPr>
+                <w:noProof/>
+              </w:rPr>
               <w:fldChar w:fldCharType="separate"/>
-              <w:t>16</w:t>
+            </w:r>
+            <w:r>
+              <w:rPr>
+                <w:noProof/>
+              </w:rPr>
+              <w:t>19</w:t>
+            </w:r>
+            <w:r>
+              <w:rPr>
+                <w:noProof/>
+              </w:rPr>
               <w:fldChar w:fldCharType="end"/>
             </w:r>
           </w:hyperlink>
@@ -2569,10 +4253,40 @@
                 <w:noProof/>
               </w:rPr>
               <w:tab/>
+            </w:r>
+            <w:r>
+              <w:rPr>
+                <w:noProof/>
+              </w:rPr>
               <w:fldChar w:fldCharType="begin"/>
+            </w:r>
+            <w:r>
+              <w:rPr>
+                <w:noProof/>
+              </w:rPr>
               <w:instrText xml:space="preserve"> PAGEREF _Toc226195304 \h </w:instrText>
+            </w:r>
+            <w:r>
+              <w:rPr>
+                <w:noProof/>
+              </w:rPr>
+            </w:r>
+            <w:r>
+              <w:rPr>
+                <w:noProof/>
+              </w:rPr>
               <w:fldChar w:fldCharType="separate"/>
-              <w:t>16</w:t>
+            </w:r>
+            <w:r>
+              <w:rPr>
+                <w:noProof/>
+              </w:rPr>
+              <w:t>19</w:t>
+            </w:r>
+            <w:r>
+              <w:rPr>
+                <w:noProof/>
+              </w:rPr>
               <w:fldChar w:fldCharType="end"/>
             </w:r>
           </w:hyperlink>
@@ -2600,10 +4314,40 @@
                 <w:noProof/>
               </w:rPr>
               <w:tab/>
+            </w:r>
+            <w:r>
+              <w:rPr>
+                <w:noProof/>
+              </w:rPr>
               <w:fldChar w:fldCharType="begin"/>
+            </w:r>
+            <w:r>
+              <w:rPr>
+                <w:noProof/>
+              </w:rPr>
               <w:instrText xml:space="preserve"> PAGEREF _Toc226195305 \h </w:instrText>
+            </w:r>
+            <w:r>
+              <w:rPr>
+                <w:noProof/>
+              </w:rPr>
+            </w:r>
+            <w:r>
+              <w:rPr>
+                <w:noProof/>
+              </w:rPr>
               <w:fldChar w:fldCharType="separate"/>
-              <w:t>17</w:t>
+            </w:r>
+            <w:r>
+              <w:rPr>
+                <w:noProof/>
+              </w:rPr>
+              <w:t>20</w:t>
+            </w:r>
+            <w:r>
+              <w:rPr>
+                <w:noProof/>
+              </w:rPr>
               <w:fldChar w:fldCharType="end"/>
             </w:r>
           </w:hyperlink>
@@ -2631,10 +4375,40 @@
                 <w:noProof/>
               </w:rPr>
               <w:tab/>
+            </w:r>
+            <w:r>
+              <w:rPr>
+                <w:noProof/>
+              </w:rPr>
               <w:fldChar w:fldCharType="begin"/>
+            </w:r>
+            <w:r>
+              <w:rPr>
+                <w:noProof/>
+              </w:rPr>
               <w:instrText xml:space="preserve"> PAGEREF _Toc226195306 \h </w:instrText>
+            </w:r>
+            <w:r>
+              <w:rPr>
+                <w:noProof/>
+              </w:rPr>
+            </w:r>
+            <w:r>
+              <w:rPr>
+                <w:noProof/>
+              </w:rPr>
               <w:fldChar w:fldCharType="separate"/>
-              <w:t>17</w:t>
+            </w:r>
+            <w:r>
+              <w:rPr>
+                <w:noProof/>
+              </w:rPr>
+              <w:t>20</w:t>
+            </w:r>
+            <w:r>
+              <w:rPr>
+                <w:noProof/>
+              </w:rPr>
               <w:fldChar w:fldCharType="end"/>
             </w:r>
           </w:hyperlink>
@@ -2662,10 +4436,40 @@
                 <w:noProof/>
               </w:rPr>
               <w:tab/>
+            </w:r>
+            <w:r>
+              <w:rPr>
+                <w:noProof/>
+              </w:rPr>
               <w:fldChar w:fldCharType="begin"/>
+            </w:r>
+            <w:r>
+              <w:rPr>
+                <w:noProof/>
+              </w:rPr>
               <w:instrText xml:space="preserve"> PAGEREF _Toc226195307 \h </w:instrText>
+            </w:r>
+            <w:r>
+              <w:rPr>
+                <w:noProof/>
+              </w:rPr>
+            </w:r>
+            <w:r>
+              <w:rPr>
+                <w:noProof/>
+              </w:rPr>
               <w:fldChar w:fldCharType="separate"/>
-              <w:t>18</w:t>
+            </w:r>
+            <w:r>
+              <w:rPr>
+                <w:noProof/>
+              </w:rPr>
+              <w:t>21</w:t>
+            </w:r>
+            <w:r>
+              <w:rPr>
+                <w:noProof/>
+              </w:rPr>
               <w:fldChar w:fldCharType="end"/>
             </w:r>
           </w:hyperlink>
@@ -2693,10 +4497,40 @@
                 <w:noProof/>
               </w:rPr>
               <w:tab/>
+            </w:r>
+            <w:r>
+              <w:rPr>
+                <w:noProof/>
+              </w:rPr>
               <w:fldChar w:fldCharType="begin"/>
+            </w:r>
+            <w:r>
+              <w:rPr>
+                <w:noProof/>
+              </w:rPr>
               <w:instrText xml:space="preserve"> PAGEREF _Toc226195308 \h </w:instrText>
+            </w:r>
+            <w:r>
+              <w:rPr>
+                <w:noProof/>
+              </w:rPr>
+            </w:r>
+            <w:r>
+              <w:rPr>
+                <w:noProof/>
+              </w:rPr>
               <w:fldChar w:fldCharType="separate"/>
-              <w:t>18</w:t>
+            </w:r>
+            <w:r>
+              <w:rPr>
+                <w:noProof/>
+              </w:rPr>
+              <w:t>21</w:t>
+            </w:r>
+            <w:r>
+              <w:rPr>
+                <w:noProof/>
+              </w:rPr>
               <w:fldChar w:fldCharType="end"/>
             </w:r>
           </w:hyperlink>
@@ -2724,10 +4558,40 @@
                 <w:noProof/>
               </w:rPr>
               <w:tab/>
+            </w:r>
+            <w:r>
+              <w:rPr>
+                <w:noProof/>
+              </w:rPr>
               <w:fldChar w:fldCharType="begin"/>
+            </w:r>
+            <w:r>
+              <w:rPr>
+                <w:noProof/>
+              </w:rPr>
               <w:instrText xml:space="preserve"> PAGEREF _Toc226195309 \h </w:instrText>
+            </w:r>
+            <w:r>
+              <w:rPr>
+                <w:noProof/>
+              </w:rPr>
+            </w:r>
+            <w:r>
+              <w:rPr>
+                <w:noProof/>
+              </w:rPr>
               <w:fldChar w:fldCharType="separate"/>
-              <w:t>18</w:t>
+            </w:r>
+            <w:r>
+              <w:rPr>
+                <w:noProof/>
+              </w:rPr>
+              <w:t>21</w:t>
+            </w:r>
+            <w:r>
+              <w:rPr>
+                <w:noProof/>
+              </w:rPr>
               <w:fldChar w:fldCharType="end"/>
             </w:r>
           </w:hyperlink>
@@ -2755,10 +4619,40 @@
                 <w:noProof/>
               </w:rPr>
               <w:tab/>
+            </w:r>
+            <w:r>
+              <w:rPr>
+                <w:noProof/>
+              </w:rPr>
               <w:fldChar w:fldCharType="begin"/>
+            </w:r>
+            <w:r>
+              <w:rPr>
+                <w:noProof/>
+              </w:rPr>
               <w:instrText xml:space="preserve"> PAGEREF _Toc226195310 \h </w:instrText>
+            </w:r>
+            <w:r>
+              <w:rPr>
+                <w:noProof/>
+              </w:rPr>
+            </w:r>
+            <w:r>
+              <w:rPr>
+                <w:noProof/>
+              </w:rPr>
               <w:fldChar w:fldCharType="separate"/>
-              <w:t>18</w:t>
+            </w:r>
+            <w:r>
+              <w:rPr>
+                <w:noProof/>
+              </w:rPr>
+              <w:t>21</w:t>
+            </w:r>
+            <w:r>
+              <w:rPr>
+                <w:noProof/>
+              </w:rPr>
               <w:fldChar w:fldCharType="end"/>
             </w:r>
           </w:hyperlink>
@@ -2786,10 +4680,40 @@
                 <w:noProof/>
               </w:rPr>
               <w:tab/>
+            </w:r>
+            <w:r>
+              <w:rPr>
+                <w:noProof/>
+              </w:rPr>
               <w:fldChar w:fldCharType="begin"/>
+            </w:r>
+            <w:r>
+              <w:rPr>
+                <w:noProof/>
+              </w:rPr>
               <w:instrText xml:space="preserve"> PAGEREF _Toc226195311 \h </w:instrText>
+            </w:r>
+            <w:r>
+              <w:rPr>
+                <w:noProof/>
+              </w:rPr>
+            </w:r>
+            <w:r>
+              <w:rPr>
+                <w:noProof/>
+              </w:rPr>
               <w:fldChar w:fldCharType="separate"/>
-              <w:t>19</w:t>
+            </w:r>
+            <w:r>
+              <w:rPr>
+                <w:noProof/>
+              </w:rPr>
+              <w:t>22</w:t>
+            </w:r>
+            <w:r>
+              <w:rPr>
+                <w:noProof/>
+              </w:rPr>
               <w:fldChar w:fldCharType="end"/>
             </w:r>
           </w:hyperlink>
@@ -3863,17 +5787,7 @@
         <w:spacing w:after="120" w:line="276" w:lineRule="auto"/>
       </w:pPr>
       <w:r>
-        <w:t xml:space="preserve">The app expects </w:t>
-      </w:r>
-      <w:r>
-        <w:rPr>
-          <w:b/>
-          <w:bCs/>
-        </w:rPr>
-        <w:t>periods</w:t>
-      </w:r>
-      <w:r>
-        <w:t xml:space="preserve"> as decimal separators (e.g., 12.5, not 12,5). If your data uses commas as decimal separators (common in continental Europe), convert the file before uploading. In Excel: open the file, check that numeric columns display correctly, then save as CSV (Comma delimited). If your regional settings use commas, change the decimal separator in Excel’s options (File → Options → Advanced → uncheck ‘Use system separators’, set Decimal separator to period) before saving.</w:t>
+        <w:t>The app expects periods as decimal separators (e.g., 12.5, not 12,5). If your data uses commas as decimal separators (common in continental Europe), convert the file before uploading. In Excel: open the file, check that numeric columns display correctly, then save as CSV (Comma delimited). If your regional settings use commas, change the decimal separator in Excel’s options (File → Options → Advanced → uncheck ‘Use system separators’, set Decimal separator to period) before saving. Exception: BLQ text entries such as '&lt;0.5' are recognised with both period and comma decimal separators — no conversion is needed for these.</w:t>
       </w:r>
     </w:p>
     <w:p>
@@ -4976,6 +6890,7 @@
         <w:spacing w:after="120" w:line="276" w:lineRule="auto"/>
       </w:pPr>
       <w:r>
+        <w:lastRenderedPageBreak/>
         <w:t>Add a Dose column if subjects received different doses (dose escalation, weight-based dosing).</w:t>
       </w:r>
     </w:p>
@@ -4985,7 +6900,6 @@
       </w:pPr>
       <w:bookmarkStart w:id="15" w:name="_Toc226195264"/>
       <w:r>
-        <w:lastRenderedPageBreak/>
         <w:t>Scenario 4: Standard 2-Period Crossover (BE)</w:t>
       </w:r>
       <w:bookmarkEnd w:id="15"/>
@@ -6304,6 +8218,7 @@
                 <w:sz w:val="20"/>
                 <w:szCs w:val="20"/>
               </w:rPr>
+              <w:lastRenderedPageBreak/>
               <w:t>Rule 6</w:t>
             </w:r>
           </w:p>
@@ -6346,7 +8261,7 @@
           <w:sz w:val="20"/>
           <w:szCs w:val="20"/>
         </w:rPr>
-        <w:t xml:space="preserve">Every assay has a lower limit of quantification (LLOQ) — the lowest concentration the assay can reliably measure. Samples collected below this threshold are reported as BLQ (Below the Limit of Quantification), meaning the drug was present but the assay could not give a precise number. You must tell the app what the LLOQ value is so it can apply the chosen rule. Set LLOQ &gt; 0 when your data contains BLQ text entries such as “&lt;0.1” or “BLQ”. The app auto-detects the LLOQ from ‘&lt;X’ entries and will offer a one-click “Apply LLOQ = X and process” button — click it to set the value and continue, or enter the LLOQ manually and click Process Data.</w:t>
+        <w:t>Every assay has a lower limit of quantification (LLOQ) — the lowest concentration the assay can reliably measure. Samples collected below this threshold are reported as BLQ (Below the Limit of Quantification), meaning the drug was present but the assay could not give a precise number. You must tell the app what the LLOQ value is so it can apply the chosen rule. Set LLOQ &gt; 0 when your data contains BLQ text entries such as “&lt;0.1” or “BLQ”. The app auto-detects the LLOQ from ‘&lt;X’ entries and will offer a one-click “Apply LLOQ = X and process” button — click it to set the value and continue, or enter the LLOQ manually and click Process Data.</w:t>
       </w:r>
     </w:p>
     <w:p>
@@ -6355,7 +8270,6 @@
       </w:pPr>
       <w:bookmarkStart w:id="21" w:name="_Toc226195270"/>
       <w:r>
-        <w:lastRenderedPageBreak/>
         <w:t>Common Mistakes</w:t>
       </w:r>
       <w:bookmarkEnd w:id="21"/>
@@ -6574,9 +8488,16 @@
         <w:spacing w:after="120" w:line="276" w:lineRule="auto"/>
       </w:pPr>
       <w:r>
-        <w:t xml:space="preserve">Y-axis scale (Linear or Log₁₀): the semi-log view makes the terminal elimination phase linear, which is useful for identifying biphasic profiles or half-life estimation issues. When log </w:t>
+        <w:t>Y-axis scale (Linear or Log₁₀): the semi-log view makes the terminal elimination phase linear, which is useful for identifying biphasic profiles or half-life estimation issues. When log scale is active and zero concentrations are present they are omitted from the plot and a note is shown.</w:t>
+      </w:r>
+    </w:p>
+    <w:p>
+      <w:pPr>
+        <w:spacing w:after="120" w:line="276" w:lineRule="auto"/>
+      </w:pPr>
+      <w:r>
         <w:lastRenderedPageBreak/>
-        <w:t>scale is active and zero concentrations are present they are omitted from the plot and a note is shown.</w:t>
+        <w:t>Colour lines by (spaghetti plot, dropdown): options are generated from the columns mapped during upload — Subject ID (always available), Treatment, Period, Sequence (each available only when that column was mapped), and None. Use “Sequence” in crossover studies to check for period effects visually.</w:t>
       </w:r>
     </w:p>
     <w:p>
@@ -6584,7 +8505,7 @@
         <w:spacing w:after="120" w:line="276" w:lineRule="auto"/>
       </w:pPr>
       <w:r>
-        <w:t>Colour lines by (spaghetti plot, dropdown): options are generated from the columns mapped during upload — Subject ID (always available), Treatment, Period, Sequence (each available only when that column was mapped), and None. Use “Sequence” in crossover studies to check for period effects visually.</w:t>
+        <w:t>Normalize to dose — C/Dose (checkbox, conditional): appears only when a Dose column was mapped. When checked, concentration values are divided by the subject’s dose, so the Y axis shows C/Dose (e.g., ng/mL per mg). Useful for overlaying profiles from dose-escalation studies. Subjects with a missing or zero dose are shown as missing. Update the Y-axis label accordingly when this is active, e.g. “C/Dose (ng·mL⁻¹·mg⁻¹)”.</w:t>
       </w:r>
     </w:p>
     <w:p>
@@ -6592,7 +8513,7 @@
         <w:spacing w:after="120" w:line="276" w:lineRule="auto"/>
       </w:pPr>
       <w:r>
-        <w:t>Normalize to dose — C/Dose (checkbox, conditional): appears only when a Dose column was mapped. When checked, concentration values are divided by the subject’s dose, so the Y axis shows C/Dose (e.g., ng/mL per mg). Useful for overlaying profiles from dose-escalation studies. Subjects with a missing or zero dose are shown as missing. Update the Y-axis label accordingly when this is active, e.g. “C/Dose (ng·mL⁻¹·mg⁻¹)”.</w:t>
+        <w:t>Colour palette: “Default (app palette)”, “Colorblind-safe (Okabe-Ito)”, or “Grayscale”. For manuscripts destined for print or journals that do not support colour, select Grayscale and export at 600 DPI.</w:t>
       </w:r>
     </w:p>
     <w:p>
@@ -6600,7 +8521,15 @@
         <w:spacing w:after="120" w:line="276" w:lineRule="auto"/>
       </w:pPr>
       <w:r>
-        <w:t>Colour palette: “Default (app palette)”, “Colorblind-safe (Okabe-Ito)”, or “Grayscale”. For manuscripts destined for print or journals that do not support colour, select Grayscale and export at 600 DPI.</w:t>
+        <w:t>Theme: “Clean (white background)” (recommended for reports), “Minimal”, or “Classic”. Axis labels, plot title, and base font size (8–18 pt) are editable text fields. The default Y-axis label is “Concentration” — edit to add units, e.g. “Cyclosporin (ng/mL)”. The default X-axis label is “Time (h)”.</w:t>
+      </w:r>
+    </w:p>
+    <w:p>
+      <w:pPr>
+        <w:pStyle w:val="Kop3"/>
+      </w:pPr>
+      <w:r>
+        <w:t>Suggested Figure Legend</w:t>
       </w:r>
     </w:p>
     <w:p>
@@ -6608,7 +8537,7 @@
         <w:spacing w:after="120" w:line="276" w:lineRule="auto"/>
       </w:pPr>
       <w:r>
-        <w:t>Theme: “Clean (white background)” (recommended for reports), “Minimal”, or “Classic”. Axis labels, plot title, and base font size (8–18 pt) are editable text fields. The default Y-axis label is “Concentration” — edit to add units, e.g. “Cyclosporin (ng/mL)”. The default X-axis label is “Time (h)”.</w:t>
+        <w:t>Immediately above the plot area, the module displays a card titled “Suggested figure legend.” This card contains a ready-to-copy text description of the current figure, automatically generated from your data and settings. It includes the number of subjects and observations, plot type, summary statistic and sample size (for summary plots), error bar definition, treatment group names when a Treatment column is mapped, a count of BLQ observations excluded from the geometric mean, Y-axis scale, and colour grouping for spaghetti plots. The legend updates automatically whenever you change settings. Copy the text, paste it into your report or manuscript, and adapt as needed — add the drug name, time units, and concentration units.</w:t>
       </w:r>
     </w:p>
     <w:p>
@@ -6616,7 +8545,7 @@
         <w:pStyle w:val="Kop3"/>
       </w:pPr>
       <w:r>
-        <w:t>Suggested Figure Legend</w:t>
+        <w:t>Exporting a Figure</w:t>
       </w:r>
     </w:p>
     <w:p>
@@ -6624,7 +8553,15 @@
         <w:spacing w:after="120" w:line="276" w:lineRule="auto"/>
       </w:pPr>
       <w:r>
-        <w:t>Immediately above the plot area, the module displays a card titled “Suggested figure legend.” This card contains a ready-to-copy text description of the current figure, automatically generated from your data and settings. It includes the number of subjects and observations, plot type, summary statistic and sample size (for summary plots), error bar definition, treatment group names when a Treatment column is mapped, a count of BLQ observations excluded from the geometric mean, Y-axis scale, and colour grouping for spaghetti plots. The legend updates automatically whenever you change settings. Copy the text, paste it into your report or manuscript, and adapt as needed — add the drug name, time units, and concentration units.</w:t>
+        <w:t>Export controls are at the bottom of the settings sidebar under the heading “Export Figure” — always visible, no separate tab required. A small “Will export” label above the Download button shows exactly which plot will be downloaded. When “Both plots” is selected, a radio button appears asking which plot to export; only one file is produced per download.</w:t>
+      </w:r>
+    </w:p>
+    <w:p>
+      <w:pPr>
+        <w:spacing w:after="120" w:line="276" w:lineRule="auto"/>
+      </w:pPr>
+      <w:r>
+        <w:t>Format: PNG (good for Word documents, presentations, and emails), PDF (vector; text and lines remain sharp at any zoom level; recommended for journal submission when the journal accepts PDF figures), or SVG (scalable vector graphics; open and edit in Inkscape, Adobe Illustrator, or similar). Width and height are set in inches (2–20 in each); typical journal requirements are 3.0–3.5 in for a single column and 6.5–7.0 in for double column. Resolution: 150 DPI (screen/drafts), 300 DPI (print, default, minimum for most journals), or 600 DPI (high-resolution journal submission). The Download button is grey until the first plot has rendered in the main panel; it turns green once a plot is visible. The exported filename includes the plot type (spaghetti_plot.png or summary_plot.png) so you can download both without overwriting either.</w:t>
       </w:r>
     </w:p>
     <w:p>
@@ -6632,7 +8569,7 @@
         <w:pStyle w:val="Kop3"/>
       </w:pPr>
       <w:r>
-        <w:t>Exporting a Figure</w:t>
+        <w:t>Interactive Preview vs. Static Export</w:t>
       </w:r>
     </w:p>
     <w:p>
@@ -6640,31 +8577,7 @@
         <w:spacing w:after="120" w:line="276" w:lineRule="auto"/>
       </w:pPr>
       <w:r>
-        <w:t>Export controls are at the bottom of the settings sidebar under the heading “Export Figure” — always visible, no separate tab required. A small “Will export” label above the Download button shows exactly which plot will be downloaded. When “Both plots” is selected, a radio button appears asking which plot to export; only one file is produced per download.</w:t>
-      </w:r>
-    </w:p>
-    <w:p>
-      <w:pPr>
-        <w:spacing w:after="120" w:line="276" w:lineRule="auto"/>
-      </w:pPr>
-      <w:r>
-        <w:t>Format: PNG (good for Word documents, presentations, and emails), PDF (vector; text and lines remain sharp at any zoom level; recommended for journal submission when the journal accepts PDF figures), or SVG (scalable vector graphics; open and edit in Inkscape, Adobe Illustrator, or similar). Width and height are set in inches (2–20 in each); typical journal requirements are 3.0–3.5 in for a single column and 6.5–7.0 in for double column. Resolution: 150 DPI (screen/drafts), 300 DPI (print, default, minimum for most journals), or 600 DPI (high-resolution journal submission). The Download button is grey until the first plot has rendered in the main panel; it turns green once a plot is visible. The exported filename includes the plot type (spaghetti_plot.png or summary_plot.png) so you can download both without overwriting either.</w:t>
-      </w:r>
-    </w:p>
-    <w:p>
-      <w:pPr>
-        <w:pStyle w:val="Kop3"/>
-      </w:pPr>
-      <w:r>
         <w:lastRenderedPageBreak/>
-        <w:t>Interactive Preview vs. Static Export</w:t>
-      </w:r>
-    </w:p>
-    <w:p>
-      <w:pPr>
-        <w:spacing w:after="120" w:line="276" w:lineRule="auto"/>
-      </w:pPr>
-      <w:r>
         <w:t>The plots shown in the main panel are interactive (built with plotly): hover over any point or line to see subject ID, time, and concentration; zoom by clicking and dragging; pan with the pan icon; reset with the home icon. These interactive features are not available in the exported static file. The static file (PNG/PDF/SVG) is built from a separate ggplot2 render using your sidebar settings — font size, theme, and colour palette — and is the version suitable for reports and manuscripts.</w:t>
       </w:r>
     </w:p>
@@ -6802,44 +8715,44 @@
         <w:spacing w:after="120" w:line="276" w:lineRule="auto"/>
       </w:pPr>
       <w:r>
+        <w:t>Step through individual profiles. Manual data entry available. Half-life inspector allows point adjustment. Downloads: CSV and Complete Analysis Record (zip with reproducibility script).</w:t>
+      </w:r>
+    </w:p>
+    <w:p>
+      <w:pPr>
+        <w:pStyle w:val="Kop2"/>
+      </w:pPr>
+      <w:bookmarkStart w:id="26" w:name="_Toc226195276"/>
+      <w:r>
         <w:lastRenderedPageBreak/>
-        <w:t>Step through individual profiles. Manual data entry available. Half-life inspector allows point adjustment. Downloads: CSV and Complete Analysis Record (zip with reproducibility script).</w:t>
+        <w:t>Path 5: Analyze All Subjects (Batch NCA)</w:t>
+      </w:r>
+      <w:bookmarkEnd w:id="26"/>
+    </w:p>
+    <w:p>
+      <w:pPr>
+        <w:spacing w:after="120" w:line="276" w:lineRule="auto"/>
+      </w:pPr>
+      <w:r>
+        <w:t>Settings: route, dose (single or per-subject), steady-state, trapezoidal method, minimum R². Result tabs: concentration–time profiles, parameter table (expandable to 37 columns; AUC % Extrapolated is flagged in amber when it exceeds 20%), summary statistics, individual grid (interactive, paginated, 12 subjects per page), half-life review. If any profiles are excluded because they contain fewer than 3 positive concentration values, a persistent amber note appears above the results tabs listing the affected subjects — check the raw data for those subjects. Downloads: CSV, Excel, Complete Analysis Record.</w:t>
       </w:r>
     </w:p>
     <w:p>
       <w:pPr>
         <w:pStyle w:val="Kop2"/>
       </w:pPr>
-      <w:bookmarkStart w:id="26" w:name="_Toc226195276"/>
-      <w:r>
-        <w:t>Path 5: Analyze All Subjects (Batch NCA)</w:t>
-      </w:r>
-      <w:bookmarkEnd w:id="26"/>
+      <w:bookmarkStart w:id="27" w:name="_Toc226195277"/>
+      <w:r>
+        <w:t>Path 6: Bioequivalence Testing</w:t>
+      </w:r>
+      <w:bookmarkEnd w:id="27"/>
     </w:p>
     <w:p>
       <w:pPr>
         <w:spacing w:after="120" w:line="276" w:lineRule="auto"/>
       </w:pPr>
       <w:r>
-        <w:t xml:space="preserve">Settings: route, dose (single or per-subject), steady-state, trapezoidal method, minimum R². Result tabs: concentration–time profiles, parameter table (expandable to 37 columns; AUC % Extrapolated is flagged in amber when it exceeds 20%), summary statistics, individual grid (interactive, paginated, 12 subjects per page), half-life review. If any profiles are excluded because they contain fewer than 3 positive concentration values, a persistent amber note appears above the results tabs listing the affected subjects — check the raw data for those subjects. Downloads: CSV, Excel, Complete Analysis Record.</w:t>
-      </w:r>
-    </w:p>
-    <w:p>
-      <w:pPr>
-        <w:pStyle w:val="Kop2"/>
-      </w:pPr>
-      <w:bookmarkStart w:id="27" w:name="_Toc226195277"/>
-      <w:r>
-        <w:t>Path 6: Bioequivalence Testing</w:t>
-      </w:r>
-      <w:bookmarkEnd w:id="27"/>
-    </w:p>
-    <w:p>
-      <w:pPr>
-        <w:spacing w:after="120" w:line="276" w:lineRule="auto"/>
-      </w:pPr>
-      <w:r>
-        <w:t xml:space="preserve">Runs NCA, then ANOVA, then 90% CI. Supports 5 designs: 2-period crossover, fixed-order crossover, 3-period crossover, replicate crossover, parallel. Fixed or mixed-effects model. Standard ABE only (80–125%). Tick “Steady-state analysis” if subjects were at steady state — the app then uses AUCτ (AUC within the dosing interval) as the primary parameter instead of AUC∞. After NCA runs, a design summary card appears showing the detected number of treatments, subjects per arm, periods, and sequences — verify this matches your intended design before interpreting the confidence intervals. If any subjects are missing data for one or more treatments, a persistent amber warning appears; resolve any imbalance before proceeding. Downloads: Excel, CSV, Complete Analysis Record.</w:t>
+        <w:t>Runs NCA, then ANOVA, then 90% CI. Supports 5 designs: 2-period crossover, fixed-order crossover, 3-period crossover, replicate crossover, parallel. Fixed or mixed-effects model. Standard ABE only (80–125%). Tick “Steady-state analysis” if subjects were at steady state — the app then uses AUCτ (AUC within the dosing interval) as the primary parameter instead of AUC∞. After NCA runs, a design summary card appears showing the detected number of treatments, subjects per arm, periods, and sequences — verify this matches your intended design before interpreting the confidence intervals. If any subjects are missing data for one or more treatments, a persistent amber warning appears; resolve any imbalance before proceeding. Downloads: Excel, CSV, Complete Analysis Record.</w:t>
       </w:r>
     </w:p>
     <w:p>
@@ -6936,6 +8849,7 @@
         <w:spacing w:after="120" w:line="276" w:lineRule="auto"/>
       </w:pPr>
       <w:r>
+        <w:lastRenderedPageBreak/>
         <w:t xml:space="preserve">• </w:t>
       </w:r>
       <w:r>
@@ -6995,7 +8909,6 @@
           <w:sz w:val="20"/>
           <w:szCs w:val="20"/>
         </w:rPr>
-        <w:lastRenderedPageBreak/>
         <w:t>These thresholds are from the FDA and EMA DDI guidance documents. The classification is based on the point estimate of the AUC ratio, not the CI boundaries.</w:t>
       </w:r>
     </w:p>
@@ -7048,7 +8961,7 @@
         <w:spacing w:after="120" w:line="276" w:lineRule="auto"/>
       </w:pPr>
       <w:r>
-        <w:t xml:space="preserve">Available in all three analysis paths (single-subject, batch NCA, and BE/DDI). Self-contained zip with: results.xlsx, analysis_settings.json, reproduce_analysis.R (standalone script), data_integrity.txt (SHA-256 hash), analysis_summary.html, and the original data file. The SHA-256 hash is a unique digital fingerprint of your data file — a 64-character code that changes if even a single character in the file is altered. Regulatory auditors use it to verify that the data file submitted with the report is byte-for-byte identical to the one analysed, providing a tamper-evident link between raw data and results.</w:t>
+        <w:t>Available in all three analysis paths (single-subject, batch NCA, and BE/DDI). Self-contained zip with: results.xlsx, analysis_settings.json, reproduce_analysis.R (standalone script), data_integrity.txt (SHA-256 hash), analysis_summary.html, and the original data file. The SHA-256 hash is a unique digital fingerprint of your data file — a 64-character code that changes if even a single character in the file is altered. Regulatory auditors use it to verify that the data file submitted with the report is byte-for-byte identical to the one analysed, providing a tamper-evident link between raw data and results.</w:t>
       </w:r>
     </w:p>
     <w:p>
@@ -7131,7 +9044,7 @@
         <w:spacing w:after="120" w:line="276" w:lineRule="auto"/>
       </w:pPr>
       <w:r>
-        <w:t xml:space="preserve">Upload. Set dose = 320, route = Oral / IM / SC (extravascular), method = Linear-up / Log-down. Run. “Extravascular” means the drug was not injected directly into a vein — it had to be absorbed first (oral, intramuscular, or subcutaneous dosing). This affects how clearance and volume of distribution are calculated: because we cannot separate how much drug reached the bloodstream from how fast it was cleared, these parameters are reported as apparent values (CL/F and Vz/F), divided by the unknown oral bioavailability F.</w:t>
+        <w:t>Upload. Set dose = 320, route = Oral / IM / SC (extravascular), method = Linear-up / Log-down. Run. “Extravascular” means the drug was not injected directly into a vein — it had to be absorbed first (oral, intramuscular, or subcutaneous dosing). This affects how clearance and volume of distribution are calculated: because we cannot separate how much drug reached the bloodstream from how fast it was cleared, these parameters are reported as apparent values (CL/F and Vz/F), divided by the unknown oral bioavailability F.</w:t>
       </w:r>
     </w:p>
     <w:p>
@@ -7519,7 +9432,11 @@
         <w:spacing w:after="120" w:line="276" w:lineRule="auto"/>
       </w:pPr>
       <w:r>
-        <w:t xml:space="preserve">Common situations requiring manual adjustment: multi-phasic elimination, flip-flop kinetics, enterohepatic recirculation, late samples near LLOQ. Use the Half-Life Review tab to inspect and adjust. To adjust manually: select a profile from the dropdown, then tick or untick the checkboxes next to individual time points in the terminal phase panel — only points after Cₓₐₓ are offered. When satisfied with the selection, click “Recalculate”. If the adjusted R² of the selected points falls below the threshold set by the slider (default 0.70), the app will not estimate λ</w:t>
+        <w:t xml:space="preserve">Common situations requiring manual adjustment: multi-phasic elimination, flip-flop kinetics, enterohepatic recirculation, late samples near LLOQ. Use the Half-Life Review tab to inspect and adjust. To adjust manually: select a profile from the dropdown, then tick or untick the checkboxes next to individual time points in the terminal phase panel — only points after </w:t>
+      </w:r>
+      <w:r>
+        <w:lastRenderedPageBreak/>
+        <w:t>Cₓₐₓ are offered. When satisfied with the selection, click “Recalculate”. If the adjusted R² of the selected points falls below the threshold set by the slider (default 0.70), the app will not estimate λ</w:t>
       </w:r>
       <w:r>
         <w:rPr>
@@ -7555,8 +9472,7 @@
         <w:spacing w:after="120" w:line="276" w:lineRule="auto"/>
       </w:pPr>
       <w:r>
-        <w:lastRenderedPageBreak/>
-        <w:t xml:space="preserve">Every assay has a lower limit of quantification (LLOQ). Samples below it are reported as BLQ (Below the Limit of Quantification). The handling choice affects AUC: zero inflates early AUC, missing truncates late AUC, LLOQ/2 is a compromise. Rule 1 (default, Beal 2001) is the most widely used. Rule 6 (LLOQ/2 for all BLQ samples before the first quantifiable observation, then zero) is for drugs with an absorption lag, where several early samples may all be BLQ before the drug appears in the bloodstream. Sensitivity analysis (two rules, compare results) is recommended for regulatory submissions.</w:t>
+        <w:t>Every assay has a lower limit of quantification (LLOQ). Samples below it are reported as BLQ (Below the Limit of Quantification). The handling choice affects AUC: zero inflates early AUC, missing truncates late AUC, LLOQ/2 is a compromise. Rule 1 (default, Beal 2001) is the most widely used. Rule 6 (LLOQ/2 for all BLQ samples before the first quantifiable observation, then zero) is for drugs with an absorption lag, where several early samples may all be BLQ before the drug appears in the bloodstream. Sensitivity analysis (two rules, compare results) is recommended for regulatory submissions.</w:t>
       </w:r>
     </w:p>
     <w:p>
@@ -7910,6 +9826,8 @@
       </w:pPr>
       <w:r>
         <w:t xml:space="preserve">DDI studies use the same statistical framework as BE. The ANOVA model, 90% CI, and geometric mean ratio are computed identically. The difference is interpretation: the ratio </w:t>
+      </w:r>
+      <w:r>
         <w:lastRenderedPageBreak/>
         <w:t>quantifies the fold-change in exposure caused by the interacting drug, and the comparison is against DDI classification thresholds (see Part III) rather than BE acceptance limits.</w:t>
       </w:r>
@@ -9912,12 +11830,15 @@
           <w:b/>
           <w:bCs/>
         </w:rPr>
-        <w:t>Comma decimals not recognised</w:t>
-      </w:r>
-      <w:r>
-        <w:t xml:space="preserve"> — Convert to period decimals before uploading (see Part II).</w:t>
-      </w:r>
-    </w:p>
+        <w:t>Comma decimals not recognised — Numeric concentration and time columns require period decimals. Use the CSV import settings (Decimal point selector) or convert before uploading. BLQ text entries (e.g., '&lt;0.5') accept both period and comma decimals automatically.</w:t>
+      </w:r>
+    </w:p>
+    <w:p>
+      <w:r>
+        <w:t>Large sampling gap warning — For multi-day studies (observation window &gt; 48 h) the threshold is 48 h, so daily trough samples are not flagged. For shorter studies the threshold is 24 h. If the gap shown is close to 24 h, it is normal sampling time variability.</w:t>
+      </w:r>
+    </w:p>
+    <w:p/>
     <w:p>
       <w:pPr>
         <w:pStyle w:val="Kop2"/>
@@ -10173,7 +12094,15 @@
         <w:sz w:val="16"/>
         <w:szCs w:val="16"/>
       </w:rPr>
-      <w:t>NCA Assistant — User Manual v1.3</w:t>
+      <w:t>NCA Assistant — User Manual v1.</w:t>
+    </w:r>
+    <w:r>
+      <w:rPr>
+        <w:color w:val="999999"/>
+        <w:sz w:val="16"/>
+        <w:szCs w:val="16"/>
+      </w:rPr>
+      <w:t>4</w:t>
     </w:r>
   </w:p>
 </w:hdr>
@@ -10917,6 +12846,48 @@
       <w:ind w:left="440"/>
     </w:pPr>
   </w:style>
+  <w:style w:type="paragraph" w:styleId="Koptekst">
+    <w:name w:val="header"/>
+    <w:basedOn w:val="Standaard"/>
+    <w:link w:val="KoptekstChar"/>
+    <w:uiPriority w:val="99"/>
+    <w:unhideWhenUsed/>
+    <w:rsid w:val="00F02DBE"/>
+    <w:pPr>
+      <w:tabs>
+        <w:tab w:val="center" w:pos="4513"/>
+        <w:tab w:val="right" w:pos="9026"/>
+      </w:tabs>
+    </w:pPr>
+  </w:style>
+  <w:style w:type="character" w:customStyle="1" w:styleId="KoptekstChar">
+    <w:name w:val="Koptekst Char"/>
+    <w:basedOn w:val="Standaardalinea-lettertype"/>
+    <w:link w:val="Koptekst"/>
+    <w:uiPriority w:val="99"/>
+    <w:rsid w:val="00F02DBE"/>
+  </w:style>
+  <w:style w:type="paragraph" w:styleId="Voettekst">
+    <w:name w:val="footer"/>
+    <w:basedOn w:val="Standaard"/>
+    <w:link w:val="VoettekstChar"/>
+    <w:uiPriority w:val="99"/>
+    <w:unhideWhenUsed/>
+    <w:rsid w:val="00F02DBE"/>
+    <w:pPr>
+      <w:tabs>
+        <w:tab w:val="center" w:pos="4513"/>
+        <w:tab w:val="right" w:pos="9026"/>
+      </w:tabs>
+    </w:pPr>
+  </w:style>
+  <w:style w:type="character" w:customStyle="1" w:styleId="VoettekstChar">
+    <w:name w:val="Voettekst Char"/>
+    <w:basedOn w:val="Standaardalinea-lettertype"/>
+    <w:link w:val="Voettekst"/>
+    <w:uiPriority w:val="99"/>
+    <w:rsid w:val="00F02DBE"/>
+  </w:style>
 </w:styles>
 </file>
 

</xml_diff>

<commit_message>
docs: manual — clarify Treatment column must use Test/Reference labels for correct ratio direction
</commit_message>
<xml_diff>
--- a/NCA_Assistant_User_Manual_v1.4.docx
+++ b/NCA_Assistant_User_Manual_v1.4.docx
@@ -6909,7 +6909,7 @@
         <w:spacing w:after="120" w:line="276" w:lineRule="auto"/>
       </w:pPr>
       <w:r>
-        <w:t>Six columns: Subject, Treatment, Period, Sequence, Time, Concentration. Time resets to 0 at the start of each period.</w:t>
+        <w:t>Six columns: Subject, Treatment, Period, Sequence, Time, Concentration. Time resets to 0 at the start of each period. Label the Treatment column 'Test' and 'Reference' — the app recognises these labels and uses Reference as the denominator in the ratio. If you use other labels (e.g., 'Drug A' and 'Drug B'), alphabetical order determines which is the denominator. The results table always shows which label was assigned as Test and which as Reference, so verify this matches your intent before interpreting the confidence interval.</w:t>
       </w:r>
     </w:p>
     <w:tbl>
@@ -7829,7 +7829,7 @@
         <w:spacing w:after="120" w:line="276" w:lineRule="auto"/>
       </w:pPr>
       <w:r>
-        <w:t>The data format is identical to a crossover BE study (Scenario 4). Use the same six columns. Label the Treatment column with the two conditions, for example ‘Alone’ and ‘With Inhibitor’ (or any two labels). See the section on analysing DDI studies in Part III for interpretation guidance.</w:t>
+        <w:t>The data format is identical to a crossover BE study (Scenario 4). Use the same six columns. The recommended approach is to label the Treatment column 'Reference' for the victim drug alone and 'Test' for the victim drug with the perpetrator. The app then automatically uses 'Reference' as the denominator and 'Test' as the numerator, producing the correct fold-change ratio. If you use custom labels instead, the app assigns them alphabetically — verify the ratio direction in the results table. See the section on analysing DDI studies in Part III for interpretation guidance.</w:t>
       </w:r>
     </w:p>
     <w:p>
@@ -7890,6 +7890,7 @@
                 <w:sz w:val="20"/>
                 <w:szCs w:val="20"/>
               </w:rPr>
+              <w:lastRenderedPageBreak/>
               <w:t>Rule</w:t>
             </w:r>
           </w:p>
@@ -8218,7 +8219,6 @@
                 <w:sz w:val="20"/>
                 <w:szCs w:val="20"/>
               </w:rPr>
-              <w:lastRenderedPageBreak/>
               <w:t>Rule 6</w:t>
             </w:r>
           </w:p>
@@ -8752,7 +8752,7 @@
         <w:spacing w:after="120" w:line="276" w:lineRule="auto"/>
       </w:pPr>
       <w:r>
-        <w:t>Runs NCA, then ANOVA, then 90% CI. Supports 5 designs: 2-period crossover, fixed-order crossover, 3-period crossover, replicate crossover, parallel. Fixed or mixed-effects model. Standard ABE only (80–125%). Tick “Steady-state analysis” if subjects were at steady state — the app then uses AUCτ (AUC within the dosing interval) as the primary parameter instead of AUC∞. After NCA runs, a design summary card appears showing the detected number of treatments, subjects per arm, periods, and sequences — verify this matches your intended design before interpreting the confidence intervals. If any subjects are missing data for one or more treatments, a persistent amber warning appears; resolve any imbalance before proceeding. Downloads: Excel, CSV, Complete Analysis Record.</w:t>
+        <w:t>Runs NCA, then ANOVA, then 90% CI. Supports 5 designs: 2-period crossover, fixed-order crossover, 3-period crossover, replicate crossover, parallel. Fixed or mixed-effects model. Standard ABE only (80–125%). Label your Treatment column 'Test' and 'Reference' for unambiguous ratio direction. Custom labels work but the app assigns them alphabetically — check the results table. Tick “Steady-state analysis” if subjects were at steady state — the app then uses AUCτ (AUC within the dosing interval) as the primary parameter instead of AUC∞. After NCA runs, a design summary card appears showing the detected number of treatments, subjects per arm, periods, and sequences — verify this matches your intended design before interpreting the confidence intervals. If any subjects are missing data for one or more treatments, a persistent amber warning appears; resolve any imbalance before proceeding. Downloads: Excel, CSV, Complete Analysis Record.</w:t>
       </w:r>
     </w:p>
     <w:p>
@@ -8788,7 +8788,7 @@
         <w:spacing w:after="120" w:line="276" w:lineRule="auto"/>
       </w:pPr>
       <w:r>
-        <w:t>Prepare your data as a crossover dataset (Scenario 4 or 5 in Part II). Label the Treatment column with the two conditions: the victim drug given alone and the victim drug given with the perpetrator. For example, use ‘Alone’ and ‘With Ketoconazole’ as treatment labels. Upload the data, map the columns, and select the appropriate crossover design in the Bioequivalence Testing settings.</w:t>
+        <w:t>Prepare your data as a crossover dataset (Scenario 4 or 5 in Part II). Label the Treatment column 'Reference' for the victim drug given alone and 'Test' for the victim drug given with the perpetrator. This ensures the ratio is calculated as (with perpetrator) ÷ (alone), which directly gives the fold-change in exposure caused by the interaction. Upload the data, map the columns, and select the appropriate crossover design in the Bioequivalence Testing settings.</w:t>
       </w:r>
     </w:p>
     <w:p>
@@ -8796,16 +8796,7 @@
         <w:spacing w:after="120" w:line="276" w:lineRule="auto"/>
       </w:pPr>
       <w:r>
-        <w:t>Run the analysis. The app produces the geometric mean ratio and 90% confidence interval for C</w:t>
-      </w:r>
-      <w:r>
-        <w:rPr>
-          <w:vertAlign w:val="subscript"/>
-        </w:rPr>
-        <w:t>max</w:t>
-      </w:r>
-      <w:r>
-        <w:t xml:space="preserve"> and AUC. The ratio represents the fold-change in exposure caused by the interacting drug: a ratio of 200% means the perpetrator doubled the victim’s exposure; a ratio of 50% means it halved it.</w:t>
+        <w:t>Run the analysis. The app produces the geometric mean ratio and 90% confidence interval for Cmax and AUC. If you labelled the conditions 'Test' and 'Reference', the ratio is Test ÷ Reference: a ratio of 200% means the perpetrator doubled the victim's exposure; a ratio of 50% means it halved it. Always verify in the results table header which label is in the numerator and which is in the denominator.</w:t>
       </w:r>
     </w:p>
     <w:p>
@@ -8831,6 +8822,7 @@
         <w:spacing w:after="120" w:line="276" w:lineRule="auto"/>
       </w:pPr>
       <w:r>
+        <w:lastRenderedPageBreak/>
         <w:t xml:space="preserve">• </w:t>
       </w:r>
       <w:r>
@@ -8849,7 +8841,6 @@
         <w:spacing w:after="120" w:line="276" w:lineRule="auto"/>
       </w:pPr>
       <w:r>
-        <w:lastRenderedPageBreak/>
         <w:t xml:space="preserve">• </w:t>
       </w:r>
       <w:r>
@@ -8927,7 +8918,7 @@
         <w:spacing w:after="120" w:line="276" w:lineRule="auto"/>
       </w:pPr>
       <w:r>
-        <w:t>The app reports the ratio as Test/Reference (expressed as a percentage). In a DDI study, ‘Test’ is typically the combination (victim + perpetrator) and ‘Reference’ is the victim alone. A reported ratio of 350% means the perpetrator increased the victim’s AUC by a factor of 3.5. If your labels are reversed, the ratio will be the reciprocal.</w:t>
+        <w:t>The app reports the ratio as Test ÷ Reference (expressed as a percentage). If you labelled your Treatment column 'Test' and 'Reference' as recommended, the ratio direction is guaranteed: 'Reference' is always the denominator. In a DDI study, label the victim drug alone as 'Reference' and the combination as 'Test'. A reported ratio of 350% then means the perpetrator increased the victim's AUC 3.5-fold. If you used custom labels, check the results table header to confirm which label is in the numerator.</w:t>
       </w:r>
     </w:p>
     <w:p>

</xml_diff>